<commit_message>
nmv 05 05 2025
</commit_message>
<xml_diff>
--- a/TS Jatai Ghanam Project/TS 1.5/TS 1.5 Jatai Malayalam Corrections.docx
+++ b/TS Jatai Ghanam Project/TS 1.5/TS 1.5 Jatai Malayalam Corrections.docx
@@ -1,7 +1,1611 @@
 
 <file path=word/document.xml><?xml version="1.0" encoding="utf-8"?>
-<w:document xmlns:wpc="http://schemas.microsoft.com/office/word/2010/wordprocessingCanvas" xmlns:cx="http://schemas.microsoft.com/office/drawing/2014/chartex" xmlns:cx1="http://schemas.microsoft.com/office/drawing/2015/9/8/chartex" xmlns:cx2="http://schemas.microsoft.com/office/drawing/2015/10/21/chartex" xmlns:cx3="http://schemas.microsoft.com/office/drawing/2016/5/9/chartex" xmlns:cx4="http://schemas.microsoft.com/office/drawing/2016/5/10/chartex" xmlns:cx5="http://schemas.microsoft.com/office/drawing/2016/5/11/chartex" xmlns:cx6="http://schemas.microsoft.com/office/drawing/2016/5/12/chartex" xmlns:cx7="http://schemas.microsoft.com/office/drawing/2016/5/13/chartex" xmlns:cx8="http://schemas.microsoft.com/office/drawing/2016/5/14/chartex" xmlns:mc="http://schemas.openxmlformats.org/markup-compatibility/2006" xmlns:aink="http://schemas.microsoft.com/office/drawing/2016/ink" xmlns:am3d="http://schemas.microsoft.com/office/drawing/2017/model3d" xmlns:o="urn:schemas-microsoft-com:office:office" xmlns:oel="http://schemas.microsoft.com/office/2019/extlst" xmlns:r="http://schemas.openxmlformats.org/officeDocument/2006/relationships" xmlns:m="http://schemas.openxmlformats.org/officeDocument/2006/math" xmlns:v="urn:schemas-microsoft-com:vml" xmlns:wp14="http://schemas.microsoft.com/office/word/2010/wordprocessingDrawing" xmlns:wp="http://schemas.openxmlformats.org/drawingml/2006/wordprocessingDrawing" xmlns:w10="urn:schemas-microsoft-com:office:word" xmlns:w="http://schemas.openxmlformats.org/wordprocessingml/2006/main" xmlns:w14="http://schemas.microsoft.com/office/word/2010/wordml" xmlns:w15="http://schemas.microsoft.com/office/word/2012/wordml" xmlns:w16cex="http://schemas.microsoft.com/office/word/2018/wordml/cex" xmlns:w16cid="http://schemas.microsoft.com/office/word/2016/wordml/cid" xmlns:w16="http://schemas.microsoft.com/office/word/2018/wordml" xmlns:w16sdtdh="http://schemas.microsoft.com/office/word/2020/wordml/sdtdatahash" xmlns:w16se="http://schemas.microsoft.com/office/word/2015/wordml/symex" xmlns:wpg="http://schemas.microsoft.com/office/word/2010/wordprocessingGroup" xmlns:wpi="http://schemas.microsoft.com/office/word/2010/wordprocessingInk" xmlns:wne="http://schemas.microsoft.com/office/word/2006/wordml" xmlns:wps="http://schemas.microsoft.com/office/word/2010/wordprocessingShape" mc:Ignorable="w14 w15 w16se w16cid w16 w16cex w16sdtdh wp14">
+<w:document xmlns:wpc="http://schemas.microsoft.com/office/word/2010/wordprocessingCanvas" xmlns:cx="http://schemas.microsoft.com/office/drawing/2014/chartex" xmlns:cx1="http://schemas.microsoft.com/office/drawing/2015/9/8/chartex" xmlns:cx2="http://schemas.microsoft.com/office/drawing/2015/10/21/chartex" xmlns:cx3="http://schemas.microsoft.com/office/drawing/2016/5/9/chartex" xmlns:cx4="http://schemas.microsoft.com/office/drawing/2016/5/10/chartex" xmlns:cx5="http://schemas.microsoft.com/office/drawing/2016/5/11/chartex" xmlns:cx6="http://schemas.microsoft.com/office/drawing/2016/5/12/chartex" xmlns:cx7="http://schemas.microsoft.com/office/drawing/2016/5/13/chartex" xmlns:cx8="http://schemas.microsoft.com/office/drawing/2016/5/14/chartex" xmlns:mc="http://schemas.openxmlformats.org/markup-compatibility/2006" xmlns:aink="http://schemas.microsoft.com/office/drawing/2016/ink" xmlns:am3d="http://schemas.microsoft.com/office/drawing/2017/model3d" xmlns:o="urn:schemas-microsoft-com:office:office" xmlns:oel="http://schemas.microsoft.com/office/2019/extlst" xmlns:r="http://schemas.openxmlformats.org/officeDocument/2006/relationships" xmlns:m="http://schemas.openxmlformats.org/officeDocument/2006/math" xmlns:v="urn:schemas-microsoft-com:vml" xmlns:wp14="http://schemas.microsoft.com/office/word/2010/wordprocessingDrawing" xmlns:wp="http://schemas.openxmlformats.org/drawingml/2006/wordprocessingDrawing" xmlns:w10="urn:schemas-microsoft-com:office:word" xmlns:w="http://schemas.openxmlformats.org/wordprocessingml/2006/main" xmlns:w14="http://schemas.microsoft.com/office/word/2010/wordml" xmlns:w15="http://schemas.microsoft.com/office/word/2012/wordml" xmlns:w16cex="http://schemas.microsoft.com/office/word/2018/wordml/cex" xmlns:w16cid="http://schemas.microsoft.com/office/word/2016/wordml/cid" xmlns:w16="http://schemas.microsoft.com/office/word/2018/wordml" xmlns:w16du="http://schemas.microsoft.com/office/word/2023/wordml/word16du" xmlns:w16sdtdh="http://schemas.microsoft.com/office/word/2020/wordml/sdtdatahash" xmlns:w16sdtfl="http://schemas.microsoft.com/office/word/2024/wordml/sdtformatlock" xmlns:w16se="http://schemas.microsoft.com/office/word/2015/wordml/symex" xmlns:wpg="http://schemas.microsoft.com/office/word/2010/wordprocessingGroup" xmlns:wpi="http://schemas.microsoft.com/office/word/2010/wordprocessingInk" xmlns:wne="http://schemas.microsoft.com/office/word/2006/wordml" xmlns:wps="http://schemas.microsoft.com/office/word/2010/wordprocessingShape" mc:Ignorable="w14 w15 w16se w16cid w16 w16cex w16sdtdh w16sdtfl w16du wp14">
   <w:body>
+    <w:p>
+      <w:pPr>
+        <w:spacing w:before="0" w:line="240" w:lineRule="auto"/>
+        <w:jc w:val="center"/>
+        <w:rPr>
+          <w:b/>
+          <w:bCs/>
+          <w:sz w:val="32"/>
+          <w:szCs w:val="32"/>
+          <w:u w:val="single"/>
+        </w:rPr>
+      </w:pPr>
+      <w:r>
+        <w:rPr>
+          <w:b/>
+          <w:bCs/>
+          <w:sz w:val="32"/>
+          <w:szCs w:val="32"/>
+          <w:u w:val="single"/>
+        </w:rPr>
+        <w:t xml:space="preserve">TS Jatai – TS 1.5 Malayalam Corrections – Observed </w:t>
+      </w:r>
+      <w:proofErr w:type="gramStart"/>
+      <w:r>
+        <w:rPr>
+          <w:b/>
+          <w:bCs/>
+          <w:sz w:val="32"/>
+          <w:szCs w:val="32"/>
+          <w:u w:val="single"/>
+        </w:rPr>
+        <w:t xml:space="preserve">till </w:t>
+      </w:r>
+      <w:r>
+        <w:rPr>
+          <w:b/>
+          <w:bCs/>
+          <w:sz w:val="32"/>
+          <w:szCs w:val="32"/>
+          <w:highlight w:val="red"/>
+          <w:u w:val="single"/>
+        </w:rPr>
+        <w:t>????</w:t>
+      </w:r>
+      <w:proofErr w:type="gramEnd"/>
+    </w:p>
+    <w:p>
+      <w:pPr>
+        <w:spacing w:before="0" w:line="240" w:lineRule="auto"/>
+        <w:jc w:val="center"/>
+        <w:rPr>
+          <w:b/>
+          <w:bCs/>
+          <w:sz w:val="28"/>
+          <w:szCs w:val="32"/>
+        </w:rPr>
+      </w:pPr>
+      <w:r>
+        <w:rPr>
+          <w:b/>
+          <w:bCs/>
+          <w:sz w:val="28"/>
+          <w:szCs w:val="32"/>
+        </w:rPr>
+        <w:t>(ignore those which are already incorporated in your book’s version and date)</w:t>
+      </w:r>
+    </w:p>
+    <w:tbl>
+      <w:tblPr>
+        <w:tblW w:w="14395" w:type="dxa"/>
+        <w:tblInd w:w="-792" w:type="dxa"/>
+        <w:tblBorders>
+          <w:top w:val="single" w:sz="4" w:space="0" w:color="000000"/>
+          <w:left w:val="single" w:sz="4" w:space="0" w:color="000000"/>
+          <w:bottom w:val="single" w:sz="4" w:space="0" w:color="000000"/>
+          <w:right w:val="single" w:sz="4" w:space="0" w:color="000000"/>
+          <w:insideH w:val="single" w:sz="4" w:space="0" w:color="000000"/>
+          <w:insideV w:val="single" w:sz="4" w:space="0" w:color="000000"/>
+        </w:tblBorders>
+        <w:tblLook w:val="04A0" w:firstRow="1" w:lastRow="0" w:firstColumn="1" w:lastColumn="0" w:noHBand="0" w:noVBand="1"/>
+      </w:tblPr>
+      <w:tblGrid>
+        <w:gridCol w:w="7166"/>
+        <w:gridCol w:w="7229"/>
+      </w:tblGrid>
+      <w:tr>
+        <w:tc>
+          <w:tcPr>
+            <w:tcW w:w="7166" w:type="dxa"/>
+          </w:tcPr>
+          <w:p>
+            <w:pPr>
+              <w:spacing w:before="0" w:line="240" w:lineRule="auto"/>
+              <w:jc w:val="center"/>
+              <w:rPr>
+                <w:b/>
+                <w:sz w:val="32"/>
+                <w:szCs w:val="32"/>
+              </w:rPr>
+            </w:pPr>
+            <w:r>
+              <w:rPr>
+                <w:b/>
+                <w:sz w:val="32"/>
+                <w:szCs w:val="32"/>
+              </w:rPr>
+              <w:t>As Printed</w:t>
+            </w:r>
+          </w:p>
+        </w:tc>
+        <w:tc>
+          <w:tcPr>
+            <w:tcW w:w="7229" w:type="dxa"/>
+          </w:tcPr>
+          <w:p>
+            <w:pPr>
+              <w:spacing w:before="0" w:line="240" w:lineRule="auto"/>
+              <w:ind w:right="-18"/>
+              <w:jc w:val="center"/>
+              <w:rPr>
+                <w:b/>
+                <w:sz w:val="32"/>
+                <w:szCs w:val="32"/>
+              </w:rPr>
+            </w:pPr>
+            <w:r>
+              <w:rPr>
+                <w:b/>
+                <w:sz w:val="32"/>
+                <w:szCs w:val="32"/>
+              </w:rPr>
+              <w:t xml:space="preserve">To be read as or corrected as </w:t>
+            </w:r>
+          </w:p>
+        </w:tc>
+      </w:tr>
+      <w:tr>
+        <w:trPr>
+          <w:trHeight w:val="2756"/>
+        </w:trPr>
+        <w:tc>
+          <w:tcPr>
+            <w:tcW w:w="7166" w:type="dxa"/>
+          </w:tcPr>
+          <w:p>
+            <w:pPr>
+              <w:widowControl w:val="0"/>
+              <w:autoSpaceDE w:val="0"/>
+              <w:autoSpaceDN w:val="0"/>
+              <w:adjustRightInd w:val="0"/>
+              <w:spacing w:before="0" w:line="240" w:lineRule="auto"/>
+              <w:rPr>
+                <w:rFonts w:ascii="BRH Malayalam Extra" w:hAnsi="BRH Malayalam Extra" w:cs="BRH Malayalam Extra"/>
+                <w:color w:val="000000"/>
+                <w:sz w:val="32"/>
+                <w:szCs w:val="40"/>
+              </w:rPr>
+            </w:pPr>
+            <w:r>
+              <w:rPr>
+                <w:rFonts w:cs="BRH Malayalam Extra"/>
+                <w:color w:val="000000"/>
+                <w:szCs w:val="40"/>
+              </w:rPr>
+              <w:t>57</w:t>
+            </w:r>
+            <w:r>
+              <w:rPr>
+                <w:rFonts w:ascii="BRH Malayalam Extra" w:hAnsi="BRH Malayalam Extra" w:cs="BRH Malayalam Extra"/>
+                <w:color w:val="000000"/>
+                <w:sz w:val="32"/>
+                <w:szCs w:val="40"/>
+              </w:rPr>
+              <w:t>)</w:t>
+            </w:r>
+            <w:r>
+              <w:rPr>
+                <w:rFonts w:ascii="BRH Malayalam Extra" w:hAnsi="BRH Malayalam Extra" w:cs="BRH Malayalam Extra"/>
+                <w:color w:val="000000"/>
+                <w:sz w:val="32"/>
+                <w:szCs w:val="40"/>
+              </w:rPr>
+              <w:tab/>
+            </w:r>
+            <w:r>
+              <w:rPr>
+                <w:rFonts w:cs="BRH Malayalam Extra"/>
+                <w:color w:val="000000"/>
+                <w:szCs w:val="40"/>
+              </w:rPr>
+              <w:t>1</w:t>
+            </w:r>
+            <w:r>
+              <w:rPr>
+                <w:rFonts w:ascii="BRH Malayalam Extra" w:hAnsi="BRH Malayalam Extra" w:cs="BRH Malayalam Extra"/>
+                <w:color w:val="000000"/>
+                <w:sz w:val="32"/>
+                <w:szCs w:val="40"/>
+              </w:rPr>
+              <w:t>.</w:t>
+            </w:r>
+            <w:r>
+              <w:rPr>
+                <w:rFonts w:cs="BRH Malayalam Extra"/>
+                <w:color w:val="000000"/>
+                <w:szCs w:val="40"/>
+              </w:rPr>
+              <w:t>5</w:t>
+            </w:r>
+            <w:r>
+              <w:rPr>
+                <w:rFonts w:ascii="BRH Malayalam Extra" w:hAnsi="BRH Malayalam Extra" w:cs="BRH Malayalam Extra"/>
+                <w:color w:val="000000"/>
+                <w:sz w:val="32"/>
+                <w:szCs w:val="40"/>
+              </w:rPr>
+              <w:t>.</w:t>
+            </w:r>
+            <w:r>
+              <w:rPr>
+                <w:rFonts w:cs="BRH Malayalam Extra"/>
+                <w:color w:val="000000"/>
+                <w:szCs w:val="40"/>
+              </w:rPr>
+              <w:t>2</w:t>
+            </w:r>
+            <w:r>
+              <w:rPr>
+                <w:rFonts w:ascii="BRH Malayalam Extra" w:hAnsi="BRH Malayalam Extra" w:cs="BRH Malayalam Extra"/>
+                <w:color w:val="000000"/>
+                <w:sz w:val="32"/>
+                <w:szCs w:val="40"/>
+              </w:rPr>
+              <w:t>.</w:t>
+            </w:r>
+            <w:r>
+              <w:rPr>
+                <w:rFonts w:cs="BRH Malayalam Extra"/>
+                <w:color w:val="000000"/>
+                <w:szCs w:val="40"/>
+              </w:rPr>
+              <w:t>1</w:t>
+            </w:r>
+            <w:r>
+              <w:rPr>
+                <w:rFonts w:ascii="BRH Malayalam Extra" w:hAnsi="BRH Malayalam Extra" w:cs="BRH Malayalam Extra"/>
+                <w:color w:val="000000"/>
+                <w:sz w:val="32"/>
+                <w:szCs w:val="40"/>
+              </w:rPr>
+              <w:t>(</w:t>
+            </w:r>
+            <w:r>
+              <w:rPr>
+                <w:rFonts w:cs="BRH Malayalam Extra"/>
+                <w:color w:val="000000"/>
+                <w:szCs w:val="40"/>
+              </w:rPr>
+              <w:t>50</w:t>
+            </w:r>
+            <w:r>
+              <w:rPr>
+                <w:rFonts w:ascii="BRH Malayalam Extra" w:hAnsi="BRH Malayalam Extra" w:cs="BRH Malayalam Extra"/>
+                <w:color w:val="000000"/>
+                <w:sz w:val="32"/>
+                <w:szCs w:val="40"/>
+              </w:rPr>
+              <w:t>)</w:t>
+            </w:r>
+            <w:proofErr w:type="gramStart"/>
+            <w:r>
+              <w:rPr>
+                <w:rFonts w:ascii="BRH Malayalam Extra" w:hAnsi="BRH Malayalam Extra" w:cs="BRH Malayalam Extra"/>
+                <w:color w:val="000000"/>
+                <w:sz w:val="32"/>
+                <w:szCs w:val="40"/>
+              </w:rPr>
+              <w:t>-  B</w:t>
+            </w:r>
+            <w:proofErr w:type="gramEnd"/>
+            <w:r>
+              <w:rPr>
+                <w:rFonts w:ascii="BRH Malayalam Extra" w:hAnsi="BRH Malayalam Extra" w:cs="BRH Malayalam Extra"/>
+                <w:color w:val="000000"/>
+                <w:sz w:val="32"/>
+                <w:szCs w:val="40"/>
+              </w:rPr>
+              <w:t xml:space="preserve"> | c</w:t>
+            </w:r>
+            <w:r>
+              <w:rPr>
+                <w:rFonts w:ascii="BRH Malayalam Extra" w:hAnsi="BRH Malayalam Extra" w:cs="BRH Malayalam Extra"/>
+                <w:color w:val="000000"/>
+                <w:sz w:val="27"/>
+                <w:szCs w:val="40"/>
+              </w:rPr>
+              <w:t>–</w:t>
+            </w:r>
+            <w:r>
+              <w:rPr>
+                <w:rFonts w:ascii="BRH Malayalam Extra" w:hAnsi="BRH Malayalam Extra" w:cs="BRH Malayalam Extra"/>
+                <w:color w:val="000000"/>
+                <w:sz w:val="32"/>
+                <w:szCs w:val="40"/>
+              </w:rPr>
+              <w:t>¥</w:t>
+            </w:r>
+            <w:r>
+              <w:rPr>
+                <w:rFonts w:ascii="BRH Malayalam Extra" w:hAnsi="BRH Malayalam Extra" w:cs="BRH Malayalam Extra"/>
+                <w:color w:val="000000"/>
+                <w:sz w:val="32"/>
+                <w:szCs w:val="40"/>
+                <w:highlight w:val="yellow"/>
+              </w:rPr>
+              <w:t>À</w:t>
+            </w:r>
+            <w:r>
+              <w:rPr>
+                <w:rFonts w:ascii="BRH Malayalam Extra" w:hAnsi="BRH Malayalam Extra" w:cs="BRH Malayalam Extra"/>
+                <w:color w:val="000000"/>
+                <w:sz w:val="32"/>
+                <w:szCs w:val="40"/>
+              </w:rPr>
+              <w:t xml:space="preserve"> |</w:t>
+            </w:r>
+          </w:p>
+          <w:p>
+            <w:pPr>
+              <w:widowControl w:val="0"/>
+              <w:autoSpaceDE w:val="0"/>
+              <w:autoSpaceDN w:val="0"/>
+              <w:adjustRightInd w:val="0"/>
+              <w:spacing w:before="0" w:line="240" w:lineRule="auto"/>
+              <w:rPr>
+                <w:rFonts w:ascii="BRH Malayalam Extra" w:hAnsi="BRH Malayalam Extra" w:cs="BRH Malayalam Extra"/>
+                <w:color w:val="000000"/>
+                <w:sz w:val="32"/>
+                <w:szCs w:val="40"/>
+              </w:rPr>
+            </w:pPr>
+            <w:r>
+              <w:rPr>
+                <w:rFonts w:ascii="BRH Malayalam Extra" w:hAnsi="BRH Malayalam Extra" w:cs="BRH Malayalam Extra"/>
+                <w:color w:val="000000"/>
+                <w:sz w:val="32"/>
+                <w:szCs w:val="40"/>
+              </w:rPr>
+              <w:t xml:space="preserve">B </w:t>
+            </w:r>
+            <w:r>
+              <w:rPr>
+                <w:rFonts w:ascii="BRH Malayalam Extra" w:hAnsi="BRH Malayalam Extra" w:cs="BRH Malayalam Extra"/>
+                <w:color w:val="000000"/>
+                <w:sz w:val="32"/>
+                <w:szCs w:val="40"/>
+                <w:highlight w:val="yellow"/>
+              </w:rPr>
+              <w:t>c</w:t>
+            </w:r>
+            <w:r>
+              <w:rPr>
+                <w:rFonts w:ascii="BRH Malayalam Extra" w:hAnsi="BRH Malayalam Extra" w:cs="BRH Malayalam Extra"/>
+                <w:color w:val="000000"/>
+                <w:sz w:val="27"/>
+                <w:szCs w:val="40"/>
+              </w:rPr>
+              <w:t>–</w:t>
+            </w:r>
+            <w:r>
+              <w:rPr>
+                <w:rFonts w:ascii="BRH Malayalam Extra" w:hAnsi="BRH Malayalam Extra" w:cs="BRH Malayalam Extra"/>
+                <w:color w:val="000000"/>
+                <w:sz w:val="32"/>
+                <w:szCs w:val="40"/>
+              </w:rPr>
+              <w:t xml:space="preserve">¥À </w:t>
+            </w:r>
+            <w:r>
+              <w:rPr>
+                <w:rFonts w:ascii="BRH Malayalam Extra" w:hAnsi="BRH Malayalam Extra" w:cs="BRH Malayalam Extra"/>
+                <w:color w:val="000000"/>
+                <w:sz w:val="32"/>
+                <w:szCs w:val="40"/>
+                <w:highlight w:val="yellow"/>
+              </w:rPr>
+              <w:t>c</w:t>
+            </w:r>
+            <w:r>
+              <w:rPr>
+                <w:rFonts w:ascii="BRH Malayalam Extra" w:hAnsi="BRH Malayalam Extra" w:cs="BRH Malayalam Extra"/>
+                <w:color w:val="000000"/>
+                <w:sz w:val="27"/>
+                <w:szCs w:val="40"/>
+                <w:highlight w:val="yellow"/>
+              </w:rPr>
+              <w:t>–</w:t>
+            </w:r>
+            <w:r>
+              <w:rPr>
+                <w:rFonts w:ascii="BRH Malayalam Extra" w:hAnsi="BRH Malayalam Extra" w:cs="BRH Malayalam Extra"/>
+                <w:color w:val="000000"/>
+                <w:sz w:val="32"/>
+                <w:szCs w:val="40"/>
+                <w:highlight w:val="yellow"/>
+              </w:rPr>
+              <w:t>À</w:t>
+            </w:r>
+            <w:r>
+              <w:rPr>
+                <w:rFonts w:ascii="BRH Malayalam Extra" w:hAnsi="BRH Malayalam Extra" w:cs="BRH Malayalam Extra"/>
+                <w:color w:val="000000"/>
+                <w:sz w:val="32"/>
+                <w:szCs w:val="40"/>
+              </w:rPr>
+              <w:t xml:space="preserve"> B </w:t>
+            </w:r>
+            <w:r>
+              <w:rPr>
+                <w:rFonts w:ascii="BRH Malayalam Extra" w:hAnsi="BRH Malayalam Extra" w:cs="BRH Malayalam Extra"/>
+                <w:color w:val="000000"/>
+                <w:sz w:val="32"/>
+                <w:szCs w:val="40"/>
+                <w:highlight w:val="yellow"/>
+              </w:rPr>
+              <w:t>c</w:t>
+            </w:r>
+            <w:r>
+              <w:rPr>
+                <w:rFonts w:ascii="BRH Malayalam Extra" w:hAnsi="BRH Malayalam Extra" w:cs="BRH Malayalam Extra"/>
+                <w:color w:val="000000"/>
+                <w:sz w:val="27"/>
+                <w:szCs w:val="40"/>
+              </w:rPr>
+              <w:t>–</w:t>
+            </w:r>
+            <w:r>
+              <w:rPr>
+                <w:rFonts w:ascii="BRH Malayalam Extra" w:hAnsi="BRH Malayalam Extra" w:cs="BRH Malayalam Extra"/>
+                <w:color w:val="000000"/>
+                <w:sz w:val="32"/>
+                <w:szCs w:val="40"/>
+              </w:rPr>
+              <w:t xml:space="preserve">¥À | </w:t>
+            </w:r>
+          </w:p>
+          <w:p>
+            <w:pPr>
+              <w:widowControl w:val="0"/>
+              <w:autoSpaceDE w:val="0"/>
+              <w:autoSpaceDN w:val="0"/>
+              <w:adjustRightInd w:val="0"/>
+              <w:spacing w:before="0" w:line="240" w:lineRule="auto"/>
+              <w:rPr>
+                <w:rFonts w:ascii="BRH Malayalam Extra" w:hAnsi="BRH Malayalam Extra" w:cs="BRH Malayalam Extra"/>
+                <w:color w:val="000000"/>
+                <w:sz w:val="32"/>
+                <w:szCs w:val="40"/>
+              </w:rPr>
+            </w:pPr>
+            <w:r>
+              <w:rPr>
+                <w:rFonts w:cs="BRH Malayalam Extra"/>
+                <w:color w:val="000000"/>
+                <w:szCs w:val="40"/>
+              </w:rPr>
+              <w:t>1</w:t>
+            </w:r>
+            <w:r>
+              <w:rPr>
+                <w:rFonts w:ascii="BRH Malayalam Extra" w:hAnsi="BRH Malayalam Extra" w:cs="BRH Malayalam Extra"/>
+                <w:color w:val="000000"/>
+                <w:sz w:val="32"/>
+                <w:szCs w:val="40"/>
+              </w:rPr>
+              <w:t>)</w:t>
+            </w:r>
+            <w:r>
+              <w:rPr>
+                <w:rFonts w:ascii="BRH Malayalam Extra" w:hAnsi="BRH Malayalam Extra" w:cs="BRH Malayalam Extra"/>
+                <w:color w:val="000000"/>
+                <w:sz w:val="32"/>
+                <w:szCs w:val="40"/>
+              </w:rPr>
+              <w:tab/>
+            </w:r>
+            <w:r>
+              <w:rPr>
+                <w:rFonts w:cs="BRH Malayalam Extra"/>
+                <w:color w:val="000000"/>
+                <w:szCs w:val="40"/>
+              </w:rPr>
+              <w:t>1</w:t>
+            </w:r>
+            <w:r>
+              <w:rPr>
+                <w:rFonts w:ascii="BRH Malayalam Extra" w:hAnsi="BRH Malayalam Extra" w:cs="BRH Malayalam Extra"/>
+                <w:color w:val="000000"/>
+                <w:sz w:val="32"/>
+                <w:szCs w:val="40"/>
+              </w:rPr>
+              <w:t>.</w:t>
+            </w:r>
+            <w:r>
+              <w:rPr>
+                <w:rFonts w:cs="BRH Malayalam Extra"/>
+                <w:color w:val="000000"/>
+                <w:szCs w:val="40"/>
+              </w:rPr>
+              <w:t>5</w:t>
+            </w:r>
+            <w:r>
+              <w:rPr>
+                <w:rFonts w:ascii="BRH Malayalam Extra" w:hAnsi="BRH Malayalam Extra" w:cs="BRH Malayalam Extra"/>
+                <w:color w:val="000000"/>
+                <w:sz w:val="32"/>
+                <w:szCs w:val="40"/>
+              </w:rPr>
+              <w:t>.</w:t>
+            </w:r>
+            <w:r>
+              <w:rPr>
+                <w:rFonts w:cs="BRH Malayalam Extra"/>
+                <w:color w:val="000000"/>
+                <w:szCs w:val="40"/>
+              </w:rPr>
+              <w:t>2</w:t>
+            </w:r>
+            <w:r>
+              <w:rPr>
+                <w:rFonts w:ascii="BRH Malayalam Extra" w:hAnsi="BRH Malayalam Extra" w:cs="BRH Malayalam Extra"/>
+                <w:color w:val="000000"/>
+                <w:sz w:val="32"/>
+                <w:szCs w:val="40"/>
+              </w:rPr>
+              <w:t>.</w:t>
+            </w:r>
+            <w:r>
+              <w:rPr>
+                <w:rFonts w:cs="BRH Malayalam Extra"/>
+                <w:color w:val="000000"/>
+                <w:szCs w:val="40"/>
+              </w:rPr>
+              <w:t>2</w:t>
+            </w:r>
+            <w:r>
+              <w:rPr>
+                <w:rFonts w:ascii="BRH Malayalam Extra" w:hAnsi="BRH Malayalam Extra" w:cs="BRH Malayalam Extra"/>
+                <w:color w:val="000000"/>
+                <w:sz w:val="32"/>
+                <w:szCs w:val="40"/>
+              </w:rPr>
+              <w:t>(</w:t>
+            </w:r>
+            <w:r>
+              <w:rPr>
+                <w:rFonts w:cs="BRH Malayalam Extra"/>
+                <w:color w:val="000000"/>
+                <w:szCs w:val="40"/>
+              </w:rPr>
+              <w:t>1</w:t>
+            </w:r>
+            <w:r>
+              <w:rPr>
+                <w:rFonts w:ascii="BRH Malayalam Extra" w:hAnsi="BRH Malayalam Extra" w:cs="BRH Malayalam Extra"/>
+                <w:color w:val="000000"/>
+                <w:sz w:val="32"/>
+                <w:szCs w:val="40"/>
+              </w:rPr>
+              <w:t>)</w:t>
+            </w:r>
+            <w:proofErr w:type="gramStart"/>
+            <w:r>
+              <w:rPr>
+                <w:rFonts w:ascii="BRH Malayalam Extra" w:hAnsi="BRH Malayalam Extra" w:cs="BRH Malayalam Extra"/>
+                <w:color w:val="000000"/>
+                <w:sz w:val="32"/>
+                <w:szCs w:val="40"/>
+              </w:rPr>
+              <w:t>-  c</w:t>
+            </w:r>
+            <w:proofErr w:type="gramEnd"/>
+            <w:r>
+              <w:rPr>
+                <w:rFonts w:ascii="BRH Malayalam Extra" w:hAnsi="BRH Malayalam Extra" w:cs="BRH Malayalam Extra"/>
+                <w:color w:val="000000"/>
+                <w:sz w:val="27"/>
+                <w:szCs w:val="40"/>
+              </w:rPr>
+              <w:t>–</w:t>
+            </w:r>
+            <w:r>
+              <w:rPr>
+                <w:rFonts w:ascii="BRH Malayalam Extra" w:hAnsi="BRH Malayalam Extra" w:cs="BRH Malayalam Extra"/>
+                <w:color w:val="000000"/>
+                <w:sz w:val="32"/>
+                <w:szCs w:val="40"/>
+              </w:rPr>
+              <w:t>¥</w:t>
+            </w:r>
+            <w:r>
+              <w:rPr>
+                <w:rFonts w:ascii="BRH Malayalam Extra" w:hAnsi="BRH Malayalam Extra" w:cs="BRH Malayalam Extra"/>
+                <w:color w:val="000000"/>
+                <w:sz w:val="32"/>
+                <w:szCs w:val="40"/>
+                <w:highlight w:val="yellow"/>
+              </w:rPr>
+              <w:t>À</w:t>
+            </w:r>
+            <w:r>
+              <w:rPr>
+                <w:rFonts w:ascii="BRH Malayalam Extra" w:hAnsi="BRH Malayalam Extra" w:cs="BRH Malayalam Extra"/>
+                <w:color w:val="000000"/>
+                <w:sz w:val="32"/>
+                <w:szCs w:val="40"/>
+              </w:rPr>
+              <w:t xml:space="preserve"> | q</w:t>
+            </w:r>
+            <w:r>
+              <w:rPr>
+                <w:rFonts w:ascii="BRH Malayalam Extra" w:hAnsi="BRH Malayalam Extra" w:cs="BRH Malayalam Extra"/>
+                <w:color w:val="000000"/>
+                <w:sz w:val="27"/>
+                <w:szCs w:val="40"/>
+              </w:rPr>
+              <w:t>–</w:t>
+            </w:r>
+            <w:r>
+              <w:rPr>
+                <w:rFonts w:ascii="BRH Malayalam Extra" w:hAnsi="BRH Malayalam Extra" w:cs="BRH Malayalam Extra"/>
+                <w:color w:val="000000"/>
+                <w:sz w:val="32"/>
+                <w:szCs w:val="40"/>
+              </w:rPr>
+              <w:t>Zx±—kxJ |</w:t>
+            </w:r>
+          </w:p>
+          <w:p>
+            <w:pPr>
+              <w:widowControl w:val="0"/>
+              <w:autoSpaceDE w:val="0"/>
+              <w:autoSpaceDN w:val="0"/>
+              <w:adjustRightInd w:val="0"/>
+              <w:spacing w:before="0" w:line="240" w:lineRule="auto"/>
+              <w:rPr>
+                <w:rFonts w:ascii="BRH Malayalam Extra" w:hAnsi="BRH Malayalam Extra" w:cs="BRH Malayalam Extra"/>
+                <w:color w:val="000000"/>
+                <w:sz w:val="32"/>
+                <w:szCs w:val="40"/>
+              </w:rPr>
+            </w:pPr>
+            <w:r>
+              <w:rPr>
+                <w:rFonts w:ascii="BRH Malayalam Extra" w:hAnsi="BRH Malayalam Extra" w:cs="BRH Malayalam Extra"/>
+                <w:color w:val="000000"/>
+                <w:sz w:val="32"/>
+                <w:szCs w:val="40"/>
+              </w:rPr>
+              <w:t>c</w:t>
+            </w:r>
+            <w:r>
+              <w:rPr>
+                <w:rFonts w:ascii="BRH Malayalam Extra" w:hAnsi="BRH Malayalam Extra" w:cs="BRH Malayalam Extra"/>
+                <w:color w:val="000000"/>
+                <w:sz w:val="27"/>
+                <w:szCs w:val="40"/>
+                <w:highlight w:val="yellow"/>
+              </w:rPr>
+              <w:t>–</w:t>
+            </w:r>
+            <w:r>
+              <w:rPr>
+                <w:rFonts w:ascii="BRH Malayalam Extra" w:hAnsi="BRH Malayalam Extra" w:cs="BRH Malayalam Extra"/>
+                <w:color w:val="000000"/>
+                <w:sz w:val="32"/>
+                <w:szCs w:val="40"/>
+                <w:highlight w:val="yellow"/>
+              </w:rPr>
+              <w:t>¥À</w:t>
+            </w:r>
+            <w:r>
+              <w:rPr>
+                <w:rFonts w:ascii="BRH Malayalam Extra" w:hAnsi="BRH Malayalam Extra" w:cs="BRH Malayalam Extra"/>
+                <w:color w:val="000000"/>
+                <w:sz w:val="32"/>
+                <w:szCs w:val="40"/>
+              </w:rPr>
+              <w:t xml:space="preserve"> q</w:t>
+            </w:r>
+            <w:r>
+              <w:rPr>
+                <w:rFonts w:ascii="BRH Malayalam Extra" w:hAnsi="BRH Malayalam Extra" w:cs="BRH Malayalam Extra"/>
+                <w:color w:val="000000"/>
+                <w:sz w:val="27"/>
+                <w:szCs w:val="40"/>
+              </w:rPr>
+              <w:t>–</w:t>
+            </w:r>
+            <w:r>
+              <w:rPr>
+                <w:rFonts w:ascii="BRH Malayalam Extra" w:hAnsi="BRH Malayalam Extra" w:cs="BRH Malayalam Extra"/>
+                <w:color w:val="000000"/>
+                <w:sz w:val="32"/>
+                <w:szCs w:val="40"/>
+              </w:rPr>
+              <w:t>Zx±—kxJ q</w:t>
+            </w:r>
+            <w:r>
+              <w:rPr>
+                <w:rFonts w:ascii="BRH Malayalam Extra" w:hAnsi="BRH Malayalam Extra" w:cs="BRH Malayalam Extra"/>
+                <w:color w:val="000000"/>
+                <w:sz w:val="27"/>
+                <w:szCs w:val="40"/>
+              </w:rPr>
+              <w:t>–</w:t>
+            </w:r>
+            <w:r>
+              <w:rPr>
+                <w:rFonts w:ascii="BRH Malayalam Extra" w:hAnsi="BRH Malayalam Extra" w:cs="BRH Malayalam Extra"/>
+                <w:color w:val="000000"/>
+                <w:sz w:val="32"/>
+                <w:szCs w:val="40"/>
+              </w:rPr>
+              <w:t xml:space="preserve">Zx±—kx </w:t>
+            </w:r>
+            <w:r>
+              <w:rPr>
+                <w:rFonts w:ascii="BRH Malayalam Extra" w:hAnsi="BRH Malayalam Extra" w:cs="BRH Malayalam Extra"/>
+                <w:color w:val="000000"/>
+                <w:sz w:val="32"/>
+                <w:szCs w:val="40"/>
+                <w:highlight w:val="yellow"/>
+              </w:rPr>
+              <w:t>c</w:t>
+            </w:r>
+            <w:r>
+              <w:rPr>
+                <w:rFonts w:ascii="BRH Malayalam Extra" w:hAnsi="BRH Malayalam Extra" w:cs="BRH Malayalam Extra"/>
+                <w:color w:val="000000"/>
+                <w:sz w:val="27"/>
+                <w:szCs w:val="40"/>
+              </w:rPr>
+              <w:t>–</w:t>
+            </w:r>
+            <w:r>
+              <w:rPr>
+                <w:rFonts w:ascii="BRH Malayalam Extra" w:hAnsi="BRH Malayalam Extra" w:cs="BRH Malayalam Extra"/>
+                <w:color w:val="000000"/>
+                <w:sz w:val="32"/>
+                <w:szCs w:val="40"/>
+              </w:rPr>
+              <w:t xml:space="preserve">¥À </w:t>
+            </w:r>
+            <w:r>
+              <w:rPr>
+                <w:rFonts w:ascii="BRH Malayalam Extra" w:hAnsi="BRH Malayalam Extra" w:cs="BRH Malayalam Extra"/>
+                <w:color w:val="000000"/>
+                <w:sz w:val="32"/>
+                <w:szCs w:val="40"/>
+                <w:highlight w:val="yellow"/>
+              </w:rPr>
+              <w:t>c</w:t>
+            </w:r>
+            <w:r>
+              <w:rPr>
+                <w:rFonts w:ascii="BRH Malayalam Extra" w:hAnsi="BRH Malayalam Extra" w:cs="BRH Malayalam Extra"/>
+                <w:color w:val="000000"/>
+                <w:sz w:val="27"/>
+                <w:szCs w:val="40"/>
+              </w:rPr>
+              <w:t>–</w:t>
+            </w:r>
+            <w:r>
+              <w:rPr>
+                <w:rFonts w:ascii="BRH Malayalam Extra" w:hAnsi="BRH Malayalam Extra" w:cs="BRH Malayalam Extra"/>
+                <w:color w:val="000000"/>
+                <w:sz w:val="32"/>
+                <w:szCs w:val="40"/>
+              </w:rPr>
+              <w:t>¥À</w:t>
+            </w:r>
+            <w:r>
+              <w:rPr>
+                <w:rFonts w:ascii="BRH Malayalam Extra" w:hAnsi="BRH Malayalam Extra" w:cs="BRH Malayalam Extra"/>
+                <w:color w:val="000000"/>
+                <w:sz w:val="32"/>
+                <w:szCs w:val="40"/>
+              </w:rPr>
+              <w:t xml:space="preserve"> </w:t>
+            </w:r>
+          </w:p>
+          <w:p>
+            <w:pPr>
+              <w:widowControl w:val="0"/>
+              <w:autoSpaceDE w:val="0"/>
+              <w:autoSpaceDN w:val="0"/>
+              <w:adjustRightInd w:val="0"/>
+              <w:spacing w:before="0" w:line="240" w:lineRule="auto"/>
+              <w:rPr>
+                <w:rFonts w:cs="BRH Malayalam Extra"/>
+                <w:szCs w:val="40"/>
+              </w:rPr>
+            </w:pPr>
+            <w:r>
+              <w:rPr>
+                <w:rFonts w:ascii="BRH Malayalam Extra" w:hAnsi="BRH Malayalam Extra" w:cs="BRH Malayalam Extra"/>
+                <w:color w:val="000000"/>
+                <w:sz w:val="32"/>
+                <w:szCs w:val="40"/>
+              </w:rPr>
+              <w:t>q</w:t>
+            </w:r>
+            <w:r>
+              <w:rPr>
+                <w:rFonts w:ascii="BRH Malayalam Extra" w:hAnsi="BRH Malayalam Extra" w:cs="BRH Malayalam Extra"/>
+                <w:color w:val="000000"/>
+                <w:sz w:val="27"/>
+                <w:szCs w:val="40"/>
+              </w:rPr>
+              <w:t>–</w:t>
+            </w:r>
+            <w:r>
+              <w:rPr>
+                <w:rFonts w:ascii="BRH Malayalam Extra" w:hAnsi="BRH Malayalam Extra" w:cs="BRH Malayalam Extra"/>
+                <w:color w:val="000000"/>
+                <w:sz w:val="32"/>
+                <w:szCs w:val="40"/>
+              </w:rPr>
+              <w:t xml:space="preserve">Zx±—kxJ | </w:t>
+            </w:r>
+          </w:p>
+        </w:tc>
+        <w:tc>
+          <w:tcPr>
+            <w:tcW w:w="7229" w:type="dxa"/>
+          </w:tcPr>
+          <w:p>
+            <w:pPr>
+              <w:widowControl w:val="0"/>
+              <w:autoSpaceDE w:val="0"/>
+              <w:autoSpaceDN w:val="0"/>
+              <w:adjustRightInd w:val="0"/>
+              <w:spacing w:before="0" w:line="240" w:lineRule="auto"/>
+              <w:rPr>
+                <w:rFonts w:ascii="BRH Malayalam Extra" w:hAnsi="BRH Malayalam Extra" w:cs="BRH Malayalam Extra"/>
+                <w:color w:val="000000"/>
+                <w:sz w:val="32"/>
+                <w:szCs w:val="40"/>
+              </w:rPr>
+            </w:pPr>
+            <w:r>
+              <w:rPr>
+                <w:rFonts w:cs="BRH Malayalam Extra"/>
+                <w:color w:val="000000"/>
+                <w:szCs w:val="40"/>
+              </w:rPr>
+              <w:t>57</w:t>
+            </w:r>
+            <w:r>
+              <w:rPr>
+                <w:rFonts w:ascii="BRH Malayalam Extra" w:hAnsi="BRH Malayalam Extra" w:cs="BRH Malayalam Extra"/>
+                <w:color w:val="000000"/>
+                <w:sz w:val="32"/>
+                <w:szCs w:val="40"/>
+              </w:rPr>
+              <w:t>)</w:t>
+            </w:r>
+            <w:r>
+              <w:rPr>
+                <w:rFonts w:ascii="BRH Malayalam Extra" w:hAnsi="BRH Malayalam Extra" w:cs="BRH Malayalam Extra"/>
+                <w:color w:val="000000"/>
+                <w:sz w:val="32"/>
+                <w:szCs w:val="40"/>
+              </w:rPr>
+              <w:tab/>
+            </w:r>
+            <w:r>
+              <w:rPr>
+                <w:rFonts w:cs="BRH Malayalam Extra"/>
+                <w:color w:val="000000"/>
+                <w:szCs w:val="40"/>
+              </w:rPr>
+              <w:t>1</w:t>
+            </w:r>
+            <w:r>
+              <w:rPr>
+                <w:rFonts w:ascii="BRH Malayalam Extra" w:hAnsi="BRH Malayalam Extra" w:cs="BRH Malayalam Extra"/>
+                <w:color w:val="000000"/>
+                <w:sz w:val="32"/>
+                <w:szCs w:val="40"/>
+              </w:rPr>
+              <w:t>.</w:t>
+            </w:r>
+            <w:r>
+              <w:rPr>
+                <w:rFonts w:cs="BRH Malayalam Extra"/>
+                <w:color w:val="000000"/>
+                <w:szCs w:val="40"/>
+              </w:rPr>
+              <w:t>5</w:t>
+            </w:r>
+            <w:r>
+              <w:rPr>
+                <w:rFonts w:ascii="BRH Malayalam Extra" w:hAnsi="BRH Malayalam Extra" w:cs="BRH Malayalam Extra"/>
+                <w:color w:val="000000"/>
+                <w:sz w:val="32"/>
+                <w:szCs w:val="40"/>
+              </w:rPr>
+              <w:t>.</w:t>
+            </w:r>
+            <w:r>
+              <w:rPr>
+                <w:rFonts w:cs="BRH Malayalam Extra"/>
+                <w:color w:val="000000"/>
+                <w:szCs w:val="40"/>
+              </w:rPr>
+              <w:t>2</w:t>
+            </w:r>
+            <w:r>
+              <w:rPr>
+                <w:rFonts w:ascii="BRH Malayalam Extra" w:hAnsi="BRH Malayalam Extra" w:cs="BRH Malayalam Extra"/>
+                <w:color w:val="000000"/>
+                <w:sz w:val="32"/>
+                <w:szCs w:val="40"/>
+              </w:rPr>
+              <w:t>.</w:t>
+            </w:r>
+            <w:r>
+              <w:rPr>
+                <w:rFonts w:cs="BRH Malayalam Extra"/>
+                <w:color w:val="000000"/>
+                <w:szCs w:val="40"/>
+              </w:rPr>
+              <w:t>1</w:t>
+            </w:r>
+            <w:r>
+              <w:rPr>
+                <w:rFonts w:ascii="BRH Malayalam Extra" w:hAnsi="BRH Malayalam Extra" w:cs="BRH Malayalam Extra"/>
+                <w:color w:val="000000"/>
+                <w:sz w:val="32"/>
+                <w:szCs w:val="40"/>
+              </w:rPr>
+              <w:t>(</w:t>
+            </w:r>
+            <w:r>
+              <w:rPr>
+                <w:rFonts w:cs="BRH Malayalam Extra"/>
+                <w:color w:val="000000"/>
+                <w:szCs w:val="40"/>
+              </w:rPr>
+              <w:t>50</w:t>
+            </w:r>
+            <w:r>
+              <w:rPr>
+                <w:rFonts w:ascii="BRH Malayalam Extra" w:hAnsi="BRH Malayalam Extra" w:cs="BRH Malayalam Extra"/>
+                <w:color w:val="000000"/>
+                <w:sz w:val="32"/>
+                <w:szCs w:val="40"/>
+              </w:rPr>
+              <w:t>)</w:t>
+            </w:r>
+            <w:proofErr w:type="gramStart"/>
+            <w:r>
+              <w:rPr>
+                <w:rFonts w:ascii="BRH Malayalam Extra" w:hAnsi="BRH Malayalam Extra" w:cs="BRH Malayalam Extra"/>
+                <w:color w:val="000000"/>
+                <w:sz w:val="32"/>
+                <w:szCs w:val="40"/>
+              </w:rPr>
+              <w:t>-  B</w:t>
+            </w:r>
+            <w:proofErr w:type="gramEnd"/>
+            <w:r>
+              <w:rPr>
+                <w:rFonts w:ascii="BRH Malayalam Extra" w:hAnsi="BRH Malayalam Extra" w:cs="BRH Malayalam Extra"/>
+                <w:color w:val="000000"/>
+                <w:sz w:val="32"/>
+                <w:szCs w:val="40"/>
+              </w:rPr>
+              <w:t xml:space="preserve"> | c</w:t>
+            </w:r>
+            <w:r>
+              <w:rPr>
+                <w:rFonts w:ascii="BRH Malayalam Extra" w:hAnsi="BRH Malayalam Extra" w:cs="BRH Malayalam Extra"/>
+                <w:color w:val="000000"/>
+                <w:sz w:val="27"/>
+                <w:szCs w:val="40"/>
+              </w:rPr>
+              <w:t>–</w:t>
+            </w:r>
+            <w:r>
+              <w:rPr>
+                <w:rFonts w:ascii="BRH Malayalam Extra" w:hAnsi="BRH Malayalam Extra" w:cs="BRH Malayalam Extra"/>
+                <w:color w:val="000000"/>
+                <w:sz w:val="32"/>
+                <w:szCs w:val="40"/>
+              </w:rPr>
+              <w:t>¥</w:t>
+            </w:r>
+            <w:r>
+              <w:rPr>
+                <w:rFonts w:ascii="BRH Malayalam Extra" w:hAnsi="BRH Malayalam Extra" w:cs="BRH Malayalam Extra"/>
+                <w:color w:val="000000"/>
+                <w:sz w:val="32"/>
+                <w:szCs w:val="40"/>
+                <w:highlight w:val="green"/>
+              </w:rPr>
+              <w:t>À</w:t>
+            </w:r>
+            <w:r>
+              <w:rPr>
+                <w:rFonts w:ascii="BRH Malayalam Extra" w:hAnsi="BRH Malayalam Extra" w:cs="BRH Malayalam Extra"/>
+                <w:color w:val="000000"/>
+                <w:sz w:val="27"/>
+                <w:szCs w:val="40"/>
+              </w:rPr>
+              <w:t>––</w:t>
+            </w:r>
+            <w:r>
+              <w:rPr>
+                <w:rFonts w:ascii="BRH Malayalam Extra" w:hAnsi="BRH Malayalam Extra" w:cs="BRH Malayalam Extra"/>
+                <w:color w:val="000000"/>
+                <w:sz w:val="32"/>
+                <w:szCs w:val="40"/>
+              </w:rPr>
+              <w:t xml:space="preserve"> |</w:t>
+            </w:r>
+          </w:p>
+          <w:p>
+            <w:pPr>
+              <w:widowControl w:val="0"/>
+              <w:autoSpaceDE w:val="0"/>
+              <w:autoSpaceDN w:val="0"/>
+              <w:adjustRightInd w:val="0"/>
+              <w:spacing w:before="0" w:line="240" w:lineRule="auto"/>
+              <w:rPr>
+                <w:rFonts w:ascii="BRH Malayalam Extra" w:hAnsi="BRH Malayalam Extra" w:cs="BRH Malayalam Extra"/>
+                <w:color w:val="000000"/>
+                <w:sz w:val="32"/>
+                <w:szCs w:val="40"/>
+              </w:rPr>
+            </w:pPr>
+            <w:r>
+              <w:rPr>
+                <w:rFonts w:ascii="BRH Malayalam Extra" w:hAnsi="BRH Malayalam Extra" w:cs="BRH Malayalam Extra"/>
+                <w:color w:val="000000"/>
+                <w:sz w:val="32"/>
+                <w:szCs w:val="40"/>
+              </w:rPr>
+              <w:t xml:space="preserve">B </w:t>
+            </w:r>
+            <w:r>
+              <w:rPr>
+                <w:rFonts w:ascii="BRH Malayalam Extra" w:hAnsi="BRH Malayalam Extra" w:cs="BRH Malayalam Extra"/>
+                <w:color w:val="000000"/>
+                <w:sz w:val="32"/>
+                <w:szCs w:val="40"/>
+                <w:highlight w:val="green"/>
+              </w:rPr>
+              <w:t>c</w:t>
+            </w:r>
+            <w:r>
+              <w:rPr>
+                <w:rFonts w:ascii="BRH Malayalam Extra" w:hAnsi="BRH Malayalam Extra" w:cs="BRH Malayalam Extra"/>
+                <w:color w:val="000000"/>
+                <w:sz w:val="32"/>
+                <w:szCs w:val="40"/>
+              </w:rPr>
+              <w:t xml:space="preserve">—¥À </w:t>
+            </w:r>
+            <w:r>
+              <w:rPr>
+                <w:rFonts w:ascii="BRH Malayalam Extra" w:hAnsi="BRH Malayalam Extra" w:cs="BRH Malayalam Extra"/>
+                <w:color w:val="000000"/>
+                <w:sz w:val="32"/>
+                <w:szCs w:val="40"/>
+                <w:highlight w:val="green"/>
+              </w:rPr>
+              <w:t>cÀ</w:t>
+            </w:r>
+            <w:r>
+              <w:rPr>
+                <w:rFonts w:ascii="BRH Malayalam Extra" w:hAnsi="BRH Malayalam Extra" w:cs="BRH Malayalam Extra"/>
+                <w:color w:val="000000"/>
+                <w:sz w:val="27"/>
+                <w:szCs w:val="40"/>
+              </w:rPr>
+              <w:t>–</w:t>
+            </w:r>
+            <w:r>
+              <w:rPr>
+                <w:rFonts w:ascii="BRH Malayalam Extra" w:hAnsi="BRH Malayalam Extra" w:cs="BRH Malayalam Extra"/>
+                <w:color w:val="000000"/>
+                <w:sz w:val="32"/>
+                <w:szCs w:val="40"/>
+              </w:rPr>
+              <w:t xml:space="preserve"> B </w:t>
+            </w:r>
+            <w:r>
+              <w:rPr>
+                <w:rFonts w:ascii="BRH Malayalam Extra" w:hAnsi="BRH Malayalam Extra" w:cs="BRH Malayalam Extra"/>
+                <w:color w:val="000000"/>
+                <w:sz w:val="32"/>
+                <w:szCs w:val="40"/>
+                <w:highlight w:val="green"/>
+              </w:rPr>
+              <w:t>c</w:t>
+            </w:r>
+            <w:r>
+              <w:rPr>
+                <w:rFonts w:ascii="BRH Malayalam Extra" w:hAnsi="BRH Malayalam Extra" w:cs="BRH Malayalam Extra"/>
+                <w:color w:val="000000"/>
+                <w:sz w:val="32"/>
+                <w:szCs w:val="40"/>
+              </w:rPr>
+              <w:t xml:space="preserve">—¥À | </w:t>
+            </w:r>
+          </w:p>
+          <w:p>
+            <w:pPr>
+              <w:widowControl w:val="0"/>
+              <w:autoSpaceDE w:val="0"/>
+              <w:autoSpaceDN w:val="0"/>
+              <w:adjustRightInd w:val="0"/>
+              <w:spacing w:before="0" w:line="240" w:lineRule="auto"/>
+              <w:rPr>
+                <w:rFonts w:ascii="BRH Malayalam Extra" w:hAnsi="BRH Malayalam Extra" w:cs="BRH Malayalam Extra"/>
+                <w:color w:val="000000"/>
+                <w:sz w:val="32"/>
+                <w:szCs w:val="40"/>
+              </w:rPr>
+            </w:pPr>
+            <w:r>
+              <w:rPr>
+                <w:rFonts w:cs="BRH Malayalam Extra"/>
+                <w:color w:val="000000"/>
+                <w:szCs w:val="40"/>
+              </w:rPr>
+              <w:t>1</w:t>
+            </w:r>
+            <w:r>
+              <w:rPr>
+                <w:rFonts w:ascii="BRH Malayalam Extra" w:hAnsi="BRH Malayalam Extra" w:cs="BRH Malayalam Extra"/>
+                <w:color w:val="000000"/>
+                <w:sz w:val="32"/>
+                <w:szCs w:val="40"/>
+              </w:rPr>
+              <w:t>)</w:t>
+            </w:r>
+            <w:r>
+              <w:rPr>
+                <w:rFonts w:ascii="BRH Malayalam Extra" w:hAnsi="BRH Malayalam Extra" w:cs="BRH Malayalam Extra"/>
+                <w:color w:val="000000"/>
+                <w:sz w:val="32"/>
+                <w:szCs w:val="40"/>
+              </w:rPr>
+              <w:tab/>
+            </w:r>
+            <w:r>
+              <w:rPr>
+                <w:rFonts w:cs="BRH Malayalam Extra"/>
+                <w:color w:val="000000"/>
+                <w:szCs w:val="40"/>
+              </w:rPr>
+              <w:t>1</w:t>
+            </w:r>
+            <w:r>
+              <w:rPr>
+                <w:rFonts w:ascii="BRH Malayalam Extra" w:hAnsi="BRH Malayalam Extra" w:cs="BRH Malayalam Extra"/>
+                <w:color w:val="000000"/>
+                <w:sz w:val="32"/>
+                <w:szCs w:val="40"/>
+              </w:rPr>
+              <w:t>.</w:t>
+            </w:r>
+            <w:r>
+              <w:rPr>
+                <w:rFonts w:cs="BRH Malayalam Extra"/>
+                <w:color w:val="000000"/>
+                <w:szCs w:val="40"/>
+              </w:rPr>
+              <w:t>5</w:t>
+            </w:r>
+            <w:r>
+              <w:rPr>
+                <w:rFonts w:ascii="BRH Malayalam Extra" w:hAnsi="BRH Malayalam Extra" w:cs="BRH Malayalam Extra"/>
+                <w:color w:val="000000"/>
+                <w:sz w:val="32"/>
+                <w:szCs w:val="40"/>
+              </w:rPr>
+              <w:t>.</w:t>
+            </w:r>
+            <w:r>
+              <w:rPr>
+                <w:rFonts w:cs="BRH Malayalam Extra"/>
+                <w:color w:val="000000"/>
+                <w:szCs w:val="40"/>
+              </w:rPr>
+              <w:t>2</w:t>
+            </w:r>
+            <w:r>
+              <w:rPr>
+                <w:rFonts w:ascii="BRH Malayalam Extra" w:hAnsi="BRH Malayalam Extra" w:cs="BRH Malayalam Extra"/>
+                <w:color w:val="000000"/>
+                <w:sz w:val="32"/>
+                <w:szCs w:val="40"/>
+              </w:rPr>
+              <w:t>.</w:t>
+            </w:r>
+            <w:r>
+              <w:rPr>
+                <w:rFonts w:cs="BRH Malayalam Extra"/>
+                <w:color w:val="000000"/>
+                <w:szCs w:val="40"/>
+              </w:rPr>
+              <w:t>2</w:t>
+            </w:r>
+            <w:r>
+              <w:rPr>
+                <w:rFonts w:ascii="BRH Malayalam Extra" w:hAnsi="BRH Malayalam Extra" w:cs="BRH Malayalam Extra"/>
+                <w:color w:val="000000"/>
+                <w:sz w:val="32"/>
+                <w:szCs w:val="40"/>
+              </w:rPr>
+              <w:t>(</w:t>
+            </w:r>
+            <w:r>
+              <w:rPr>
+                <w:rFonts w:cs="BRH Malayalam Extra"/>
+                <w:color w:val="000000"/>
+                <w:szCs w:val="40"/>
+              </w:rPr>
+              <w:t>1</w:t>
+            </w:r>
+            <w:r>
+              <w:rPr>
+                <w:rFonts w:ascii="BRH Malayalam Extra" w:hAnsi="BRH Malayalam Extra" w:cs="BRH Malayalam Extra"/>
+                <w:color w:val="000000"/>
+                <w:sz w:val="32"/>
+                <w:szCs w:val="40"/>
+              </w:rPr>
+              <w:t>)</w:t>
+            </w:r>
+            <w:proofErr w:type="gramStart"/>
+            <w:r>
+              <w:rPr>
+                <w:rFonts w:ascii="BRH Malayalam Extra" w:hAnsi="BRH Malayalam Extra" w:cs="BRH Malayalam Extra"/>
+                <w:color w:val="000000"/>
+                <w:sz w:val="32"/>
+                <w:szCs w:val="40"/>
+              </w:rPr>
+              <w:t>-  c</w:t>
+            </w:r>
+            <w:proofErr w:type="gramEnd"/>
+            <w:r>
+              <w:rPr>
+                <w:rFonts w:ascii="BRH Malayalam Extra" w:hAnsi="BRH Malayalam Extra" w:cs="BRH Malayalam Extra"/>
+                <w:color w:val="000000"/>
+                <w:sz w:val="27"/>
+                <w:szCs w:val="40"/>
+              </w:rPr>
+              <w:t>–</w:t>
+            </w:r>
+            <w:r>
+              <w:rPr>
+                <w:rFonts w:ascii="BRH Malayalam Extra" w:hAnsi="BRH Malayalam Extra" w:cs="BRH Malayalam Extra"/>
+                <w:color w:val="000000"/>
+                <w:sz w:val="32"/>
+                <w:szCs w:val="40"/>
+              </w:rPr>
+              <w:t>¥</w:t>
+            </w:r>
+            <w:r>
+              <w:rPr>
+                <w:rFonts w:ascii="BRH Malayalam Extra" w:hAnsi="BRH Malayalam Extra" w:cs="BRH Malayalam Extra"/>
+                <w:color w:val="000000"/>
+                <w:sz w:val="32"/>
+                <w:szCs w:val="40"/>
+                <w:highlight w:val="green"/>
+              </w:rPr>
+              <w:t>À</w:t>
+            </w:r>
+            <w:r>
+              <w:rPr>
+                <w:rFonts w:ascii="BRH Malayalam Extra" w:hAnsi="BRH Malayalam Extra" w:cs="BRH Malayalam Extra"/>
+                <w:color w:val="000000"/>
+                <w:sz w:val="27"/>
+                <w:szCs w:val="40"/>
+                <w:highlight w:val="green"/>
+              </w:rPr>
+              <w:t>–</w:t>
+            </w:r>
+            <w:r>
+              <w:rPr>
+                <w:rFonts w:ascii="BRH Malayalam Extra" w:hAnsi="BRH Malayalam Extra" w:cs="BRH Malayalam Extra"/>
+                <w:color w:val="000000"/>
+                <w:sz w:val="32"/>
+                <w:szCs w:val="40"/>
+              </w:rPr>
+              <w:t xml:space="preserve"> | q</w:t>
+            </w:r>
+            <w:r>
+              <w:rPr>
+                <w:rFonts w:ascii="BRH Malayalam Extra" w:hAnsi="BRH Malayalam Extra" w:cs="BRH Malayalam Extra"/>
+                <w:color w:val="000000"/>
+                <w:sz w:val="27"/>
+                <w:szCs w:val="40"/>
+              </w:rPr>
+              <w:t>–</w:t>
+            </w:r>
+            <w:r>
+              <w:rPr>
+                <w:rFonts w:ascii="BRH Malayalam Extra" w:hAnsi="BRH Malayalam Extra" w:cs="BRH Malayalam Extra"/>
+                <w:color w:val="000000"/>
+                <w:sz w:val="32"/>
+                <w:szCs w:val="40"/>
+              </w:rPr>
+              <w:t>Zx±—kxJ |</w:t>
+            </w:r>
+          </w:p>
+          <w:p>
+            <w:pPr>
+              <w:widowControl w:val="0"/>
+              <w:autoSpaceDE w:val="0"/>
+              <w:autoSpaceDN w:val="0"/>
+              <w:adjustRightInd w:val="0"/>
+              <w:spacing w:before="0" w:line="240" w:lineRule="auto"/>
+              <w:rPr>
+                <w:rFonts w:ascii="BRH Malayalam Extra" w:hAnsi="BRH Malayalam Extra" w:cs="BRH Malayalam Extra"/>
+                <w:color w:val="000000"/>
+                <w:sz w:val="32"/>
+                <w:szCs w:val="40"/>
+              </w:rPr>
+            </w:pPr>
+            <w:r>
+              <w:rPr>
+                <w:rFonts w:ascii="BRH Malayalam Extra" w:hAnsi="BRH Malayalam Extra" w:cs="BRH Malayalam Extra"/>
+                <w:color w:val="000000"/>
+                <w:sz w:val="32"/>
+                <w:szCs w:val="40"/>
+              </w:rPr>
+              <w:t>c</w:t>
+            </w:r>
+            <w:r>
+              <w:rPr>
+                <w:rFonts w:ascii="BRH Malayalam Extra" w:hAnsi="BRH Malayalam Extra" w:cs="BRH Malayalam Extra"/>
+                <w:color w:val="000000"/>
+                <w:sz w:val="27"/>
+                <w:szCs w:val="40"/>
+                <w:highlight w:val="green"/>
+              </w:rPr>
+              <w:t>–</w:t>
+            </w:r>
+            <w:r>
+              <w:rPr>
+                <w:rFonts w:ascii="BRH Malayalam Extra" w:hAnsi="BRH Malayalam Extra" w:cs="BRH Malayalam Extra"/>
+                <w:color w:val="000000"/>
+                <w:sz w:val="32"/>
+                <w:szCs w:val="40"/>
+                <w:highlight w:val="green"/>
+              </w:rPr>
+              <w:t>¥À</w:t>
+            </w:r>
+            <w:r>
+              <w:rPr>
+                <w:rFonts w:ascii="BRH Malayalam Extra" w:hAnsi="BRH Malayalam Extra" w:cs="BRH Malayalam Extra"/>
+                <w:color w:val="000000"/>
+                <w:sz w:val="27"/>
+                <w:szCs w:val="40"/>
+              </w:rPr>
+              <w:t>–</w:t>
+            </w:r>
+            <w:r>
+              <w:rPr>
+                <w:rFonts w:ascii="BRH Malayalam Extra" w:hAnsi="BRH Malayalam Extra" w:cs="BRH Malayalam Extra"/>
+                <w:color w:val="000000"/>
+                <w:sz w:val="32"/>
+                <w:szCs w:val="40"/>
+              </w:rPr>
+              <w:t xml:space="preserve"> q</w:t>
+            </w:r>
+            <w:r>
+              <w:rPr>
+                <w:rFonts w:ascii="BRH Malayalam Extra" w:hAnsi="BRH Malayalam Extra" w:cs="BRH Malayalam Extra"/>
+                <w:color w:val="000000"/>
+                <w:sz w:val="27"/>
+                <w:szCs w:val="40"/>
+              </w:rPr>
+              <w:t>–</w:t>
+            </w:r>
+            <w:r>
+              <w:rPr>
+                <w:rFonts w:ascii="BRH Malayalam Extra" w:hAnsi="BRH Malayalam Extra" w:cs="BRH Malayalam Extra"/>
+                <w:color w:val="000000"/>
+                <w:sz w:val="32"/>
+                <w:szCs w:val="40"/>
+              </w:rPr>
+              <w:t>Zx±—kxJ q</w:t>
+            </w:r>
+            <w:r>
+              <w:rPr>
+                <w:rFonts w:ascii="BRH Malayalam Extra" w:hAnsi="BRH Malayalam Extra" w:cs="BRH Malayalam Extra"/>
+                <w:color w:val="000000"/>
+                <w:sz w:val="27"/>
+                <w:szCs w:val="40"/>
+              </w:rPr>
+              <w:t>–</w:t>
+            </w:r>
+            <w:r>
+              <w:rPr>
+                <w:rFonts w:ascii="BRH Malayalam Extra" w:hAnsi="BRH Malayalam Extra" w:cs="BRH Malayalam Extra"/>
+                <w:color w:val="000000"/>
+                <w:sz w:val="32"/>
+                <w:szCs w:val="40"/>
+              </w:rPr>
+              <w:t xml:space="preserve">Zx±—kx </w:t>
+            </w:r>
+            <w:r>
+              <w:rPr>
+                <w:rFonts w:ascii="BRH Malayalam Extra" w:hAnsi="BRH Malayalam Extra" w:cs="BRH Malayalam Extra"/>
+                <w:color w:val="000000"/>
+                <w:sz w:val="32"/>
+                <w:szCs w:val="40"/>
+                <w:highlight w:val="green"/>
+              </w:rPr>
+              <w:t>c</w:t>
+            </w:r>
+            <w:r>
+              <w:rPr>
+                <w:rFonts w:ascii="BRH Malayalam Extra" w:hAnsi="BRH Malayalam Extra" w:cs="BRH Malayalam Extra"/>
+                <w:color w:val="000000"/>
+                <w:sz w:val="32"/>
+                <w:szCs w:val="40"/>
+              </w:rPr>
+              <w:t xml:space="preserve">¥À </w:t>
+            </w:r>
+            <w:r>
+              <w:rPr>
+                <w:rFonts w:ascii="BRH Malayalam Extra" w:hAnsi="BRH Malayalam Extra" w:cs="BRH Malayalam Extra"/>
+                <w:color w:val="000000"/>
+                <w:sz w:val="32"/>
+                <w:szCs w:val="40"/>
+                <w:highlight w:val="green"/>
+              </w:rPr>
+              <w:t>c</w:t>
+            </w:r>
+            <w:r>
+              <w:rPr>
+                <w:rFonts w:ascii="BRH Malayalam Extra" w:hAnsi="BRH Malayalam Extra" w:cs="BRH Malayalam Extra"/>
+                <w:color w:val="000000"/>
+                <w:sz w:val="32"/>
+                <w:szCs w:val="40"/>
+              </w:rPr>
+              <w:t>¥À</w:t>
+            </w:r>
+            <w:r>
+              <w:rPr>
+                <w:rFonts w:ascii="BRH Malayalam Extra" w:hAnsi="BRH Malayalam Extra" w:cs="BRH Malayalam Extra"/>
+                <w:color w:val="000000"/>
+                <w:sz w:val="32"/>
+                <w:szCs w:val="40"/>
+              </w:rPr>
+              <w:t xml:space="preserve"> </w:t>
+            </w:r>
+          </w:p>
+          <w:p>
+            <w:pPr>
+              <w:widowControl w:val="0"/>
+              <w:autoSpaceDE w:val="0"/>
+              <w:autoSpaceDN w:val="0"/>
+              <w:adjustRightInd w:val="0"/>
+              <w:spacing w:before="0" w:line="240" w:lineRule="auto"/>
+              <w:rPr>
+                <w:rFonts w:cs="BRH Malayalam Extra"/>
+                <w:szCs w:val="40"/>
+              </w:rPr>
+            </w:pPr>
+            <w:r>
+              <w:rPr>
+                <w:rFonts w:ascii="BRH Malayalam Extra" w:hAnsi="BRH Malayalam Extra" w:cs="BRH Malayalam Extra"/>
+                <w:color w:val="000000"/>
+                <w:sz w:val="32"/>
+                <w:szCs w:val="40"/>
+              </w:rPr>
+              <w:t>q</w:t>
+            </w:r>
+            <w:r>
+              <w:rPr>
+                <w:rFonts w:ascii="BRH Malayalam Extra" w:hAnsi="BRH Malayalam Extra" w:cs="BRH Malayalam Extra"/>
+                <w:color w:val="000000"/>
+                <w:sz w:val="27"/>
+                <w:szCs w:val="40"/>
+              </w:rPr>
+              <w:t>–</w:t>
+            </w:r>
+            <w:r>
+              <w:rPr>
+                <w:rFonts w:ascii="BRH Malayalam Extra" w:hAnsi="BRH Malayalam Extra" w:cs="BRH Malayalam Extra"/>
+                <w:color w:val="000000"/>
+                <w:sz w:val="32"/>
+                <w:szCs w:val="40"/>
+              </w:rPr>
+              <w:t xml:space="preserve">Zx±—kxJ | </w:t>
+            </w:r>
+          </w:p>
+        </w:tc>
+      </w:tr>
+      <w:tr>
+        <w:trPr>
+          <w:trHeight w:val="1197"/>
+        </w:trPr>
+        <w:tc>
+          <w:tcPr>
+            <w:tcW w:w="7166" w:type="dxa"/>
+          </w:tcPr>
+          <w:p>
+            <w:pPr>
+              <w:widowControl w:val="0"/>
+              <w:autoSpaceDE w:val="0"/>
+              <w:autoSpaceDN w:val="0"/>
+              <w:adjustRightInd w:val="0"/>
+              <w:spacing w:before="0" w:line="240" w:lineRule="auto"/>
+              <w:rPr>
+                <w:rFonts w:cs="BRH Malayalam Extra"/>
+                <w:szCs w:val="40"/>
+              </w:rPr>
+            </w:pPr>
+          </w:p>
+        </w:tc>
+        <w:tc>
+          <w:tcPr>
+            <w:tcW w:w="7229" w:type="dxa"/>
+          </w:tcPr>
+          <w:p>
+            <w:pPr>
+              <w:widowControl w:val="0"/>
+              <w:autoSpaceDE w:val="0"/>
+              <w:autoSpaceDN w:val="0"/>
+              <w:adjustRightInd w:val="0"/>
+              <w:spacing w:before="0" w:line="240" w:lineRule="auto"/>
+              <w:rPr>
+                <w:rFonts w:cs="BRH Malayalam Extra"/>
+                <w:b/>
+                <w:bCs/>
+                <w:szCs w:val="40"/>
+              </w:rPr>
+            </w:pPr>
+          </w:p>
+        </w:tc>
+      </w:tr>
+    </w:tbl>
+    <w:p>
+      <w:pPr>
+        <w:spacing w:before="0" w:line="240" w:lineRule="auto"/>
+        <w:jc w:val="center"/>
+        <w:rPr>
+          <w:b/>
+          <w:bCs/>
+          <w:sz w:val="32"/>
+          <w:szCs w:val="32"/>
+          <w:u w:val="single"/>
+        </w:rPr>
+      </w:pPr>
+    </w:p>
+    <w:p>
+      <w:pPr>
+        <w:spacing w:before="0" w:line="240" w:lineRule="auto"/>
+        <w:jc w:val="center"/>
+        <w:rPr>
+          <w:b/>
+          <w:bCs/>
+          <w:sz w:val="32"/>
+          <w:szCs w:val="32"/>
+          <w:u w:val="single"/>
+        </w:rPr>
+      </w:pPr>
+    </w:p>
+    <w:p>
+      <w:pPr>
+        <w:spacing w:before="0" w:line="240" w:lineRule="auto"/>
+        <w:jc w:val="center"/>
+        <w:rPr>
+          <w:b/>
+          <w:bCs/>
+          <w:sz w:val="32"/>
+          <w:szCs w:val="32"/>
+          <w:u w:val="single"/>
+        </w:rPr>
+      </w:pPr>
+    </w:p>
+    <w:p>
+      <w:pPr>
+        <w:spacing w:before="0" w:line="240" w:lineRule="auto"/>
+        <w:jc w:val="center"/>
+        <w:rPr>
+          <w:b/>
+          <w:bCs/>
+          <w:sz w:val="32"/>
+          <w:szCs w:val="32"/>
+          <w:u w:val="single"/>
+        </w:rPr>
+      </w:pPr>
+    </w:p>
     <w:p>
       <w:pPr>
         <w:spacing w:before="0" w:line="240" w:lineRule="auto"/>
@@ -113,27 +1717,7 @@
           <w:sz w:val="28"/>
           <w:szCs w:val="32"/>
         </w:rPr>
-        <w:t>(</w:t>
-      </w:r>
-      <w:proofErr w:type="gramStart"/>
-      <w:r>
-        <w:rPr>
-          <w:b/>
-          <w:bCs/>
-          <w:sz w:val="28"/>
-          <w:szCs w:val="32"/>
-        </w:rPr>
-        <w:t>ignore</w:t>
-      </w:r>
-      <w:proofErr w:type="gramEnd"/>
-      <w:r>
-        <w:rPr>
-          <w:b/>
-          <w:bCs/>
-          <w:sz w:val="28"/>
-          <w:szCs w:val="32"/>
-        </w:rPr>
-        <w:t xml:space="preserve"> those which are already incorporated in your book’s version and date)</w:t>
+        <w:t>(ignore those which are already incorporated in your book’s version and date)</w:t>
       </w:r>
     </w:p>
     <w:tbl>
@@ -656,6 +2240,7 @@
                 <w:szCs w:val="40"/>
                 <w:lang w:val="it-IT"/>
               </w:rPr>
+              <w:lastRenderedPageBreak/>
               <w:t>52</w:t>
             </w:r>
             <w:r>
@@ -3377,7 +4962,6 @@
                 <w:rFonts w:cs="BRH Malayalam Extra"/>
                 <w:szCs w:val="40"/>
               </w:rPr>
-              <w:lastRenderedPageBreak/>
               <w:t>57</w:t>
             </w:r>
             <w:r>
@@ -3810,6 +5394,7 @@
                 <w:sz w:val="32"/>
                 <w:szCs w:val="40"/>
               </w:rPr>
+              <w:lastRenderedPageBreak/>
               <w:t>py</w:t>
             </w:r>
             <w:r>
@@ -4205,6 +5790,7 @@
                 <w:rFonts w:cs="BRH Malayalam Extra"/>
                 <w:szCs w:val="40"/>
               </w:rPr>
+              <w:lastRenderedPageBreak/>
               <w:t>57</w:t>
             </w:r>
             <w:r>
@@ -4659,6 +6245,7 @@
                 <w:sz w:val="32"/>
                 <w:szCs w:val="40"/>
               </w:rPr>
+              <w:lastRenderedPageBreak/>
               <w:t>py</w:t>
             </w:r>
             <w:r>
@@ -5059,6 +6646,7 @@
                 <w:rFonts w:cs="BRH Malayalam Extra"/>
                 <w:szCs w:val="40"/>
               </w:rPr>
+              <w:lastRenderedPageBreak/>
               <w:t>8</w:t>
             </w:r>
             <w:r>
@@ -6152,7 +7740,6 @@
                 <w:szCs w:val="40"/>
                 <w:lang w:val="it-IT"/>
               </w:rPr>
-              <w:lastRenderedPageBreak/>
               <w:t>13</w:t>
             </w:r>
             <w:r>
@@ -8176,6 +9763,7 @@
                 <w:rFonts w:cs="BRH Malayalam Extra"/>
                 <w:szCs w:val="40"/>
               </w:rPr>
+              <w:lastRenderedPageBreak/>
               <w:t>1</w:t>
             </w:r>
             <w:r>
@@ -10292,7 +11880,6 @@
                 <w:szCs w:val="40"/>
                 <w:lang w:val="it-IT"/>
               </w:rPr>
-              <w:lastRenderedPageBreak/>
               <w:t>6</w:t>
             </w:r>
             <w:r>
@@ -11601,6 +13188,7 @@
                 <w:szCs w:val="40"/>
                 <w:lang w:val="it-IT"/>
               </w:rPr>
+              <w:lastRenderedPageBreak/>
               <w:t>19</w:t>
             </w:r>
             <w:r>
@@ -11951,6 +13539,7 @@
                 <w:szCs w:val="40"/>
                 <w:lang w:val="it-IT"/>
               </w:rPr>
+              <w:lastRenderedPageBreak/>
               <w:t>17</w:t>
             </w:r>
             <w:r>
@@ -12778,6 +14367,7 @@
                 <w:szCs w:val="40"/>
                 <w:lang w:val="it-IT"/>
               </w:rPr>
+              <w:lastRenderedPageBreak/>
               <w:t>19</w:t>
             </w:r>
             <w:r>
@@ -13115,6 +14705,7 @@
                 <w:szCs w:val="40"/>
                 <w:lang w:val="it-IT"/>
               </w:rPr>
+              <w:lastRenderedPageBreak/>
               <w:t>42</w:t>
             </w:r>
             <w:r>
@@ -14347,7 +15938,6 @@
                 <w:rFonts w:cs="BRH Malayalam Extra"/>
                 <w:szCs w:val="40"/>
               </w:rPr>
-              <w:lastRenderedPageBreak/>
               <w:t>11</w:t>
             </w:r>
             <w:r>
@@ -16802,6 +18392,7 @@
                 <w:rFonts w:cs="BRH Malayalam Extra"/>
                 <w:szCs w:val="40"/>
               </w:rPr>
+              <w:lastRenderedPageBreak/>
               <w:t>45</w:t>
             </w:r>
             <w:r>
@@ -18406,14 +19997,15 @@
                 <w:rFonts w:ascii="BRH Malayalam Extra" w:hAnsi="BRH Malayalam Extra" w:cs="BRH Malayalam Extra"/>
                 <w:sz w:val="32"/>
                 <w:szCs w:val="40"/>
+                <w:lang w:val="it-IT"/>
               </w:rPr>
             </w:pPr>
             <w:r>
               <w:rPr>
                 <w:rFonts w:cs="BRH Malayalam Extra"/>
                 <w:szCs w:val="40"/>
-              </w:rPr>
-              <w:lastRenderedPageBreak/>
+                <w:lang w:val="it-IT"/>
+              </w:rPr>
               <w:t>6</w:t>
             </w:r>
             <w:r>
@@ -18421,6 +20013,7 @@
                 <w:rFonts w:ascii="BRH Malayalam Extra" w:hAnsi="BRH Malayalam Extra" w:cs="BRH Malayalam Extra"/>
                 <w:sz w:val="32"/>
                 <w:szCs w:val="40"/>
+                <w:lang w:val="it-IT"/>
               </w:rPr>
               <w:t>)</w:t>
             </w:r>
@@ -18429,6 +20022,7 @@
                 <w:rFonts w:ascii="BRH Malayalam Extra" w:hAnsi="BRH Malayalam Extra" w:cs="BRH Malayalam Extra"/>
                 <w:sz w:val="32"/>
                 <w:szCs w:val="40"/>
+                <w:lang w:val="it-IT"/>
               </w:rPr>
               <w:tab/>
             </w:r>
@@ -18436,6 +20030,7 @@
               <w:rPr>
                 <w:rFonts w:cs="BRH Malayalam Extra"/>
                 <w:szCs w:val="40"/>
+                <w:lang w:val="it-IT"/>
               </w:rPr>
               <w:t>1</w:t>
             </w:r>
@@ -18444,6 +20039,7 @@
                 <w:rFonts w:ascii="BRH Malayalam Extra" w:hAnsi="BRH Malayalam Extra" w:cs="BRH Malayalam Extra"/>
                 <w:sz w:val="32"/>
                 <w:szCs w:val="40"/>
+                <w:lang w:val="it-IT"/>
               </w:rPr>
               <w:t>.</w:t>
             </w:r>
@@ -18451,6 +20047,7 @@
               <w:rPr>
                 <w:rFonts w:cs="BRH Malayalam Extra"/>
                 <w:szCs w:val="40"/>
+                <w:lang w:val="it-IT"/>
               </w:rPr>
               <w:t>5</w:t>
             </w:r>
@@ -18459,6 +20056,7 @@
                 <w:rFonts w:ascii="BRH Malayalam Extra" w:hAnsi="BRH Malayalam Extra" w:cs="BRH Malayalam Extra"/>
                 <w:sz w:val="32"/>
                 <w:szCs w:val="40"/>
+                <w:lang w:val="it-IT"/>
               </w:rPr>
               <w:t>.</w:t>
             </w:r>
@@ -18466,6 +20064,7 @@
               <w:rPr>
                 <w:rFonts w:cs="BRH Malayalam Extra"/>
                 <w:szCs w:val="40"/>
+                <w:lang w:val="it-IT"/>
               </w:rPr>
               <w:t>7</w:t>
             </w:r>
@@ -18474,6 +20073,7 @@
                 <w:rFonts w:ascii="BRH Malayalam Extra" w:hAnsi="BRH Malayalam Extra" w:cs="BRH Malayalam Extra"/>
                 <w:sz w:val="32"/>
                 <w:szCs w:val="40"/>
+                <w:lang w:val="it-IT"/>
               </w:rPr>
               <w:t>.</w:t>
             </w:r>
@@ -18481,6 +20081,7 @@
               <w:rPr>
                 <w:rFonts w:cs="BRH Malayalam Extra"/>
                 <w:szCs w:val="40"/>
+                <w:lang w:val="it-IT"/>
               </w:rPr>
               <w:t>4</w:t>
             </w:r>
@@ -18489,6 +20090,7 @@
                 <w:rFonts w:ascii="BRH Malayalam Extra" w:hAnsi="BRH Malayalam Extra" w:cs="BRH Malayalam Extra"/>
                 <w:sz w:val="32"/>
                 <w:szCs w:val="40"/>
+                <w:lang w:val="it-IT"/>
               </w:rPr>
               <w:t>(</w:t>
             </w:r>
@@ -18496,6 +20098,7 @@
               <w:rPr>
                 <w:rFonts w:cs="BRH Malayalam Extra"/>
                 <w:szCs w:val="40"/>
+                <w:lang w:val="it-IT"/>
               </w:rPr>
               <w:t>6</w:t>
             </w:r>
@@ -18504,6 +20107,7 @@
                 <w:rFonts w:ascii="BRH Malayalam Extra" w:hAnsi="BRH Malayalam Extra" w:cs="BRH Malayalam Extra"/>
                 <w:sz w:val="32"/>
                 <w:szCs w:val="40"/>
+                <w:lang w:val="it-IT"/>
               </w:rPr>
               <w:t>)-  Zy</w:t>
             </w:r>
@@ -18512,14 +20116,16 @@
                 <w:rFonts w:ascii="BRH Malayalam Extra" w:hAnsi="BRH Malayalam Extra" w:cs="BRH Malayalam Extra"/>
                 <w:sz w:val="27"/>
                 <w:szCs w:val="40"/>
-              </w:rPr>
-              <w:t>–</w:t>
-            </w:r>
-            <w:r>
-              <w:rPr>
-                <w:rFonts w:ascii="BRH Malayalam Extra" w:hAnsi="BRH Malayalam Extra" w:cs="BRH Malayalam Extra"/>
-                <w:sz w:val="32"/>
-                <w:szCs w:val="40"/>
+                <w:lang w:val="it-IT"/>
+              </w:rPr>
+              <w:t>–</w:t>
+            </w:r>
+            <w:r>
+              <w:rPr>
+                <w:rFonts w:ascii="BRH Malayalam Extra" w:hAnsi="BRH Malayalam Extra" w:cs="BRH Malayalam Extra"/>
+                <w:sz w:val="32"/>
+                <w:szCs w:val="40"/>
+                <w:lang w:val="it-IT"/>
               </w:rPr>
               <w:t>rç</w:t>
             </w:r>
@@ -18528,14 +20134,16 @@
                 <w:rFonts w:ascii="BRH Malayalam Extra" w:hAnsi="BRH Malayalam Extra" w:cs="BRH Malayalam Extra"/>
                 <w:sz w:val="27"/>
                 <w:szCs w:val="40"/>
-              </w:rPr>
-              <w:t>–</w:t>
-            </w:r>
-            <w:r>
-              <w:rPr>
-                <w:rFonts w:ascii="BRH Malayalam Extra" w:hAnsi="BRH Malayalam Extra" w:cs="BRH Malayalam Extra"/>
-                <w:sz w:val="32"/>
-                <w:szCs w:val="40"/>
+                <w:lang w:val="it-IT"/>
+              </w:rPr>
+              <w:t>–</w:t>
+            </w:r>
+            <w:r>
+              <w:rPr>
+                <w:rFonts w:ascii="BRH Malayalam Extra" w:hAnsi="BRH Malayalam Extra" w:cs="BRH Malayalam Extra"/>
+                <w:sz w:val="32"/>
+                <w:szCs w:val="40"/>
+                <w:lang w:val="it-IT"/>
               </w:rPr>
               <w:t>¥Z</w:t>
             </w:r>
@@ -18544,14 +20152,16 @@
                 <w:rFonts w:ascii="BRH Malayalam Extra" w:hAnsi="BRH Malayalam Extra" w:cs="BRH Malayalam Extra"/>
                 <w:sz w:val="27"/>
                 <w:szCs w:val="40"/>
-              </w:rPr>
-              <w:t>–</w:t>
-            </w:r>
-            <w:r>
-              <w:rPr>
-                <w:rFonts w:ascii="BRH Malayalam Extra" w:hAnsi="BRH Malayalam Extra" w:cs="BRH Malayalam Extra"/>
-                <w:sz w:val="32"/>
-                <w:szCs w:val="40"/>
+                <w:lang w:val="it-IT"/>
+              </w:rPr>
+              <w:t>–</w:t>
+            </w:r>
+            <w:r>
+              <w:rPr>
+                <w:rFonts w:ascii="BRH Malayalam Extra" w:hAnsi="BRH Malayalam Extra" w:cs="BRH Malayalam Extra"/>
+                <w:sz w:val="32"/>
+                <w:szCs w:val="40"/>
+                <w:lang w:val="it-IT"/>
               </w:rPr>
               <w:t xml:space="preserve"> | </w:t>
             </w:r>
@@ -18561,6 +20171,7 @@
                 <w:sz w:val="32"/>
                 <w:szCs w:val="40"/>
                 <w:highlight w:val="yellow"/>
+                <w:lang w:val="it-IT"/>
               </w:rPr>
               <w:t>jx</w:t>
             </w:r>
@@ -18569,6 +20180,7 @@
                 <w:rFonts w:ascii="BRH Malayalam Extra" w:hAnsi="BRH Malayalam Extra" w:cs="BRH Malayalam Extra"/>
                 <w:sz w:val="32"/>
                 <w:szCs w:val="40"/>
+                <w:lang w:val="it-IT"/>
               </w:rPr>
               <w:t xml:space="preserve">P§Tx | </w:t>
             </w:r>
@@ -18584,6 +20196,7 @@
                 <w:rFonts w:ascii="BRH Malayalam Extra" w:hAnsi="BRH Malayalam Extra" w:cs="BRH Malayalam Extra"/>
                 <w:sz w:val="32"/>
                 <w:szCs w:val="40"/>
+                <w:lang w:val="it-IT"/>
               </w:rPr>
             </w:pPr>
             <w:r>
@@ -18591,6 +20204,7 @@
                 <w:rFonts w:ascii="BRH Malayalam Extra" w:hAnsi="BRH Malayalam Extra" w:cs="BRH Malayalam Extra"/>
                 <w:sz w:val="32"/>
                 <w:szCs w:val="40"/>
+                <w:lang w:val="it-IT"/>
               </w:rPr>
               <w:t>Zy</w:t>
             </w:r>
@@ -18599,14 +20213,16 @@
                 <w:rFonts w:ascii="BRH Malayalam Extra" w:hAnsi="BRH Malayalam Extra" w:cs="BRH Malayalam Extra"/>
                 <w:sz w:val="27"/>
                 <w:szCs w:val="40"/>
-              </w:rPr>
-              <w:t>–</w:t>
-            </w:r>
-            <w:r>
-              <w:rPr>
-                <w:rFonts w:ascii="BRH Malayalam Extra" w:hAnsi="BRH Malayalam Extra" w:cs="BRH Malayalam Extra"/>
-                <w:sz w:val="32"/>
-                <w:szCs w:val="40"/>
+                <w:lang w:val="it-IT"/>
+              </w:rPr>
+              <w:t>–</w:t>
+            </w:r>
+            <w:r>
+              <w:rPr>
+                <w:rFonts w:ascii="BRH Malayalam Extra" w:hAnsi="BRH Malayalam Extra" w:cs="BRH Malayalam Extra"/>
+                <w:sz w:val="32"/>
+                <w:szCs w:val="40"/>
+                <w:lang w:val="it-IT"/>
               </w:rPr>
               <w:t>rç</w:t>
             </w:r>
@@ -18615,14 +20231,16 @@
                 <w:rFonts w:ascii="BRH Malayalam Extra" w:hAnsi="BRH Malayalam Extra" w:cs="BRH Malayalam Extra"/>
                 <w:sz w:val="27"/>
                 <w:szCs w:val="40"/>
-              </w:rPr>
-              <w:t>–</w:t>
-            </w:r>
-            <w:r>
-              <w:rPr>
-                <w:rFonts w:ascii="BRH Malayalam Extra" w:hAnsi="BRH Malayalam Extra" w:cs="BRH Malayalam Extra"/>
-                <w:sz w:val="32"/>
-                <w:szCs w:val="40"/>
+                <w:lang w:val="it-IT"/>
+              </w:rPr>
+              <w:t>–</w:t>
+            </w:r>
+            <w:r>
+              <w:rPr>
+                <w:rFonts w:ascii="BRH Malayalam Extra" w:hAnsi="BRH Malayalam Extra" w:cs="BRH Malayalam Extra"/>
+                <w:sz w:val="32"/>
+                <w:szCs w:val="40"/>
+                <w:lang w:val="it-IT"/>
               </w:rPr>
               <w:t>¥Z</w:t>
             </w:r>
@@ -18631,14 +20249,16 @@
                 <w:rFonts w:ascii="BRH Malayalam Extra" w:hAnsi="BRH Malayalam Extra" w:cs="BRH Malayalam Extra"/>
                 <w:sz w:val="27"/>
                 <w:szCs w:val="40"/>
-              </w:rPr>
-              <w:t>–</w:t>
-            </w:r>
-            <w:r>
-              <w:rPr>
-                <w:rFonts w:ascii="BRH Malayalam Extra" w:hAnsi="BRH Malayalam Extra" w:cs="BRH Malayalam Extra"/>
-                <w:sz w:val="32"/>
-                <w:szCs w:val="40"/>
+                <w:lang w:val="it-IT"/>
+              </w:rPr>
+              <w:t>–</w:t>
+            </w:r>
+            <w:r>
+              <w:rPr>
+                <w:rFonts w:ascii="BRH Malayalam Extra" w:hAnsi="BRH Malayalam Extra" w:cs="BRH Malayalam Extra"/>
+                <w:sz w:val="32"/>
+                <w:szCs w:val="40"/>
+                <w:lang w:val="it-IT"/>
               </w:rPr>
               <w:t xml:space="preserve"> </w:t>
             </w:r>
@@ -18648,6 +20268,7 @@
                 <w:sz w:val="32"/>
                 <w:szCs w:val="40"/>
                 <w:highlight w:val="yellow"/>
+                <w:lang w:val="it-IT"/>
               </w:rPr>
               <w:t>jx</w:t>
             </w:r>
@@ -18656,6 +20277,7 @@
                 <w:rFonts w:ascii="BRH Malayalam Extra" w:hAnsi="BRH Malayalam Extra" w:cs="BRH Malayalam Extra"/>
                 <w:sz w:val="32"/>
                 <w:szCs w:val="40"/>
+                <w:lang w:val="it-IT"/>
               </w:rPr>
               <w:t xml:space="preserve">P§Tx </w:t>
             </w:r>
@@ -18665,6 +20287,7 @@
                 <w:sz w:val="32"/>
                 <w:szCs w:val="40"/>
                 <w:highlight w:val="yellow"/>
+                <w:lang w:val="it-IT"/>
               </w:rPr>
               <w:t>jx</w:t>
             </w:r>
@@ -18673,6 +20296,7 @@
                 <w:rFonts w:ascii="BRH Malayalam Extra" w:hAnsi="BRH Malayalam Extra" w:cs="BRH Malayalam Extra"/>
                 <w:sz w:val="32"/>
                 <w:szCs w:val="40"/>
+                <w:lang w:val="it-IT"/>
               </w:rPr>
               <w:t>P§Tx Zy—rç¥Z Zyrç¥Z</w:t>
             </w:r>
@@ -18681,14 +20305,16 @@
                 <w:rFonts w:ascii="BRH Malayalam Extra" w:hAnsi="BRH Malayalam Extra" w:cs="BRH Malayalam Extra"/>
                 <w:sz w:val="27"/>
                 <w:szCs w:val="40"/>
-              </w:rPr>
-              <w:t>–</w:t>
-            </w:r>
-            <w:r>
-              <w:rPr>
-                <w:rFonts w:ascii="BRH Malayalam Extra" w:hAnsi="BRH Malayalam Extra" w:cs="BRH Malayalam Extra"/>
-                <w:sz w:val="32"/>
-                <w:szCs w:val="40"/>
+                <w:lang w:val="it-IT"/>
+              </w:rPr>
+              <w:t>–</w:t>
+            </w:r>
+            <w:r>
+              <w:rPr>
+                <w:rFonts w:ascii="BRH Malayalam Extra" w:hAnsi="BRH Malayalam Extra" w:cs="BRH Malayalam Extra"/>
+                <w:sz w:val="32"/>
+                <w:szCs w:val="40"/>
+                <w:lang w:val="it-IT"/>
               </w:rPr>
               <w:t xml:space="preserve"> </w:t>
             </w:r>
@@ -18698,6 +20324,7 @@
                 <w:sz w:val="32"/>
                 <w:szCs w:val="40"/>
                 <w:highlight w:val="yellow"/>
+                <w:lang w:val="it-IT"/>
               </w:rPr>
               <w:t>jx</w:t>
             </w:r>
@@ -18706,6 +20333,7 @@
                 <w:rFonts w:ascii="BRH Malayalam Extra" w:hAnsi="BRH Malayalam Extra" w:cs="BRH Malayalam Extra"/>
                 <w:sz w:val="32"/>
                 <w:szCs w:val="40"/>
+                <w:lang w:val="it-IT"/>
               </w:rPr>
               <w:t xml:space="preserve">P§Tx | </w:t>
             </w:r>
@@ -18721,12 +20349,14 @@
                 <w:rFonts w:ascii="BRH Malayalam Extra" w:hAnsi="BRH Malayalam Extra" w:cs="BRH Malayalam Extra"/>
                 <w:sz w:val="32"/>
                 <w:szCs w:val="40"/>
+                <w:lang w:val="it-IT"/>
               </w:rPr>
             </w:pPr>
             <w:r>
               <w:rPr>
                 <w:rFonts w:cs="BRH Malayalam Extra"/>
                 <w:szCs w:val="40"/>
+                <w:lang w:val="it-IT"/>
               </w:rPr>
               <w:t>7</w:t>
             </w:r>
@@ -18735,6 +20365,7 @@
                 <w:rFonts w:ascii="BRH Malayalam Extra" w:hAnsi="BRH Malayalam Extra" w:cs="BRH Malayalam Extra"/>
                 <w:sz w:val="32"/>
                 <w:szCs w:val="40"/>
+                <w:lang w:val="it-IT"/>
               </w:rPr>
               <w:t>)</w:t>
             </w:r>
@@ -18743,6 +20374,7 @@
                 <w:rFonts w:ascii="BRH Malayalam Extra" w:hAnsi="BRH Malayalam Extra" w:cs="BRH Malayalam Extra"/>
                 <w:sz w:val="32"/>
                 <w:szCs w:val="40"/>
+                <w:lang w:val="it-IT"/>
               </w:rPr>
               <w:tab/>
             </w:r>
@@ -18750,6 +20382,7 @@
               <w:rPr>
                 <w:rFonts w:cs="BRH Malayalam Extra"/>
                 <w:szCs w:val="40"/>
+                <w:lang w:val="it-IT"/>
               </w:rPr>
               <w:t>1</w:t>
             </w:r>
@@ -18758,6 +20391,7 @@
                 <w:rFonts w:ascii="BRH Malayalam Extra" w:hAnsi="BRH Malayalam Extra" w:cs="BRH Malayalam Extra"/>
                 <w:sz w:val="32"/>
                 <w:szCs w:val="40"/>
+                <w:lang w:val="it-IT"/>
               </w:rPr>
               <w:t>.</w:t>
             </w:r>
@@ -18765,6 +20399,7 @@
               <w:rPr>
                 <w:rFonts w:cs="BRH Malayalam Extra"/>
                 <w:szCs w:val="40"/>
+                <w:lang w:val="it-IT"/>
               </w:rPr>
               <w:t>5</w:t>
             </w:r>
@@ -18773,6 +20408,7 @@
                 <w:rFonts w:ascii="BRH Malayalam Extra" w:hAnsi="BRH Malayalam Extra" w:cs="BRH Malayalam Extra"/>
                 <w:sz w:val="32"/>
                 <w:szCs w:val="40"/>
+                <w:lang w:val="it-IT"/>
               </w:rPr>
               <w:t>.</w:t>
             </w:r>
@@ -18780,6 +20416,7 @@
               <w:rPr>
                 <w:rFonts w:cs="BRH Malayalam Extra"/>
                 <w:szCs w:val="40"/>
+                <w:lang w:val="it-IT"/>
               </w:rPr>
               <w:t>7</w:t>
             </w:r>
@@ -18788,6 +20425,7 @@
                 <w:rFonts w:ascii="BRH Malayalam Extra" w:hAnsi="BRH Malayalam Extra" w:cs="BRH Malayalam Extra"/>
                 <w:sz w:val="32"/>
                 <w:szCs w:val="40"/>
+                <w:lang w:val="it-IT"/>
               </w:rPr>
               <w:t>.</w:t>
             </w:r>
@@ -18795,6 +20433,7 @@
               <w:rPr>
                 <w:rFonts w:cs="BRH Malayalam Extra"/>
                 <w:szCs w:val="40"/>
+                <w:lang w:val="it-IT"/>
               </w:rPr>
               <w:t>4</w:t>
             </w:r>
@@ -18803,6 +20442,7 @@
                 <w:rFonts w:ascii="BRH Malayalam Extra" w:hAnsi="BRH Malayalam Extra" w:cs="BRH Malayalam Extra"/>
                 <w:sz w:val="32"/>
                 <w:szCs w:val="40"/>
+                <w:lang w:val="it-IT"/>
               </w:rPr>
               <w:t>(</w:t>
             </w:r>
@@ -18810,6 +20450,7 @@
               <w:rPr>
                 <w:rFonts w:cs="BRH Malayalam Extra"/>
                 <w:szCs w:val="40"/>
+                <w:lang w:val="it-IT"/>
               </w:rPr>
               <w:t>7</w:t>
             </w:r>
@@ -18818,6 +20459,7 @@
                 <w:rFonts w:ascii="BRH Malayalam Extra" w:hAnsi="BRH Malayalam Extra" w:cs="BRH Malayalam Extra"/>
                 <w:sz w:val="32"/>
                 <w:szCs w:val="40"/>
+                <w:lang w:val="it-IT"/>
               </w:rPr>
               <w:t xml:space="preserve">)-  </w:t>
             </w:r>
@@ -18827,6 +20469,7 @@
                 <w:sz w:val="32"/>
                 <w:szCs w:val="40"/>
                 <w:highlight w:val="yellow"/>
+                <w:lang w:val="it-IT"/>
               </w:rPr>
               <w:t>jx</w:t>
             </w:r>
@@ -18835,6 +20478,7 @@
                 <w:rFonts w:ascii="BRH Malayalam Extra" w:hAnsi="BRH Malayalam Extra" w:cs="BRH Malayalam Extra"/>
                 <w:sz w:val="32"/>
                 <w:szCs w:val="40"/>
+                <w:lang w:val="it-IT"/>
               </w:rPr>
               <w:t>P§Tx | G</w:t>
             </w:r>
@@ -18843,14 +20487,16 @@
                 <w:rFonts w:ascii="BRH Malayalam Extra" w:hAnsi="BRH Malayalam Extra" w:cs="BRH Malayalam Extra"/>
                 <w:sz w:val="27"/>
                 <w:szCs w:val="40"/>
-              </w:rPr>
-              <w:t>–</w:t>
-            </w:r>
-            <w:r>
-              <w:rPr>
-                <w:rFonts w:ascii="BRH Malayalam Extra" w:hAnsi="BRH Malayalam Extra" w:cs="BRH Malayalam Extra"/>
-                <w:sz w:val="32"/>
-                <w:szCs w:val="40"/>
+                <w:lang w:val="it-IT"/>
+              </w:rPr>
+              <w:t>–</w:t>
+            </w:r>
+            <w:r>
+              <w:rPr>
+                <w:rFonts w:ascii="BRH Malayalam Extra" w:hAnsi="BRH Malayalam Extra" w:cs="BRH Malayalam Extra"/>
+                <w:sz w:val="32"/>
+                <w:szCs w:val="40"/>
+                <w:lang w:val="it-IT"/>
               </w:rPr>
               <w:t xml:space="preserve">p | </w:t>
             </w:r>
@@ -18865,6 +20511,7 @@
               <w:rPr>
                 <w:rFonts w:cs="BRH Malayalam Extra"/>
                 <w:szCs w:val="40"/>
+                <w:lang w:val="it-IT"/>
               </w:rPr>
             </w:pPr>
             <w:r>
@@ -18873,6 +20520,7 @@
                 <w:sz w:val="32"/>
                 <w:szCs w:val="40"/>
                 <w:highlight w:val="yellow"/>
+                <w:lang w:val="it-IT"/>
               </w:rPr>
               <w:t>jx</w:t>
             </w:r>
@@ -18881,6 +20529,7 @@
                 <w:rFonts w:ascii="BRH Malayalam" w:hAnsi="BRH Malayalam" w:cs="BRH Malayalam"/>
                 <w:sz w:val="32"/>
                 <w:szCs w:val="40"/>
+                <w:lang w:val="it-IT"/>
               </w:rPr>
               <w:t xml:space="preserve">P§¤¤T¤¤pp </w:t>
             </w:r>
@@ -18890,6 +20539,7 @@
                 <w:sz w:val="32"/>
                 <w:szCs w:val="40"/>
                 <w:highlight w:val="yellow"/>
+                <w:lang w:val="it-IT"/>
               </w:rPr>
               <w:t>jx</w:t>
             </w:r>
@@ -18898,6 +20548,7 @@
                 <w:rFonts w:ascii="BRH Malayalam" w:hAnsi="BRH Malayalam" w:cs="BRH Malayalam"/>
                 <w:sz w:val="32"/>
                 <w:szCs w:val="40"/>
+                <w:lang w:val="it-IT"/>
               </w:rPr>
               <w:t xml:space="preserve">P§Tx </w:t>
             </w:r>
@@ -18907,6 +20558,7 @@
                 <w:sz w:val="32"/>
                 <w:szCs w:val="40"/>
                 <w:highlight w:val="yellow"/>
+                <w:lang w:val="it-IT"/>
               </w:rPr>
               <w:t>jx</w:t>
             </w:r>
@@ -18915,6 +20567,7 @@
                 <w:rFonts w:ascii="BRH Malayalam" w:hAnsi="BRH Malayalam" w:cs="BRH Malayalam"/>
                 <w:sz w:val="32"/>
                 <w:szCs w:val="40"/>
+                <w:lang w:val="it-IT"/>
               </w:rPr>
               <w:t xml:space="preserve">P§¤¤Tp | </w:t>
             </w:r>
@@ -18935,12 +20588,14 @@
                 <w:rFonts w:ascii="BRH Malayalam Extra" w:hAnsi="BRH Malayalam Extra" w:cs="BRH Malayalam Extra"/>
                 <w:sz w:val="32"/>
                 <w:szCs w:val="40"/>
+                <w:lang w:val="it-IT"/>
               </w:rPr>
             </w:pPr>
             <w:r>
               <w:rPr>
                 <w:rFonts w:cs="BRH Malayalam Extra"/>
                 <w:szCs w:val="40"/>
+                <w:lang w:val="it-IT"/>
               </w:rPr>
               <w:t>6</w:t>
             </w:r>
@@ -18949,6 +20604,7 @@
                 <w:rFonts w:ascii="BRH Malayalam Extra" w:hAnsi="BRH Malayalam Extra" w:cs="BRH Malayalam Extra"/>
                 <w:sz w:val="32"/>
                 <w:szCs w:val="40"/>
+                <w:lang w:val="it-IT"/>
               </w:rPr>
               <w:t>)</w:t>
             </w:r>
@@ -18957,6 +20613,7 @@
                 <w:rFonts w:ascii="BRH Malayalam Extra" w:hAnsi="BRH Malayalam Extra" w:cs="BRH Malayalam Extra"/>
                 <w:sz w:val="32"/>
                 <w:szCs w:val="40"/>
+                <w:lang w:val="it-IT"/>
               </w:rPr>
               <w:tab/>
             </w:r>
@@ -18964,6 +20621,7 @@
               <w:rPr>
                 <w:rFonts w:cs="BRH Malayalam Extra"/>
                 <w:szCs w:val="40"/>
+                <w:lang w:val="it-IT"/>
               </w:rPr>
               <w:t>1</w:t>
             </w:r>
@@ -18972,6 +20630,7 @@
                 <w:rFonts w:ascii="BRH Malayalam Extra" w:hAnsi="BRH Malayalam Extra" w:cs="BRH Malayalam Extra"/>
                 <w:sz w:val="32"/>
                 <w:szCs w:val="40"/>
+                <w:lang w:val="it-IT"/>
               </w:rPr>
               <w:t>.</w:t>
             </w:r>
@@ -18979,6 +20638,7 @@
               <w:rPr>
                 <w:rFonts w:cs="BRH Malayalam Extra"/>
                 <w:szCs w:val="40"/>
+                <w:lang w:val="it-IT"/>
               </w:rPr>
               <w:t>5</w:t>
             </w:r>
@@ -18987,6 +20647,7 @@
                 <w:rFonts w:ascii="BRH Malayalam Extra" w:hAnsi="BRH Malayalam Extra" w:cs="BRH Malayalam Extra"/>
                 <w:sz w:val="32"/>
                 <w:szCs w:val="40"/>
+                <w:lang w:val="it-IT"/>
               </w:rPr>
               <w:t>.</w:t>
             </w:r>
@@ -18994,6 +20655,7 @@
               <w:rPr>
                 <w:rFonts w:cs="BRH Malayalam Extra"/>
                 <w:szCs w:val="40"/>
+                <w:lang w:val="it-IT"/>
               </w:rPr>
               <w:t>7</w:t>
             </w:r>
@@ -19002,6 +20664,7 @@
                 <w:rFonts w:ascii="BRH Malayalam Extra" w:hAnsi="BRH Malayalam Extra" w:cs="BRH Malayalam Extra"/>
                 <w:sz w:val="32"/>
                 <w:szCs w:val="40"/>
+                <w:lang w:val="it-IT"/>
               </w:rPr>
               <w:t>.</w:t>
             </w:r>
@@ -19009,6 +20672,7 @@
               <w:rPr>
                 <w:rFonts w:cs="BRH Malayalam Extra"/>
                 <w:szCs w:val="40"/>
+                <w:lang w:val="it-IT"/>
               </w:rPr>
               <w:t>4</w:t>
             </w:r>
@@ -19017,6 +20681,7 @@
                 <w:rFonts w:ascii="BRH Malayalam Extra" w:hAnsi="BRH Malayalam Extra" w:cs="BRH Malayalam Extra"/>
                 <w:sz w:val="32"/>
                 <w:szCs w:val="40"/>
+                <w:lang w:val="it-IT"/>
               </w:rPr>
               <w:t>(</w:t>
             </w:r>
@@ -19024,6 +20689,7 @@
               <w:rPr>
                 <w:rFonts w:cs="BRH Malayalam Extra"/>
                 <w:szCs w:val="40"/>
+                <w:lang w:val="it-IT"/>
               </w:rPr>
               <w:t>6</w:t>
             </w:r>
@@ -19032,6 +20698,7 @@
                 <w:rFonts w:ascii="BRH Malayalam Extra" w:hAnsi="BRH Malayalam Extra" w:cs="BRH Malayalam Extra"/>
                 <w:sz w:val="32"/>
                 <w:szCs w:val="40"/>
+                <w:lang w:val="it-IT"/>
               </w:rPr>
               <w:t>)-  Zy</w:t>
             </w:r>
@@ -19040,14 +20707,16 @@
                 <w:rFonts w:ascii="BRH Malayalam Extra" w:hAnsi="BRH Malayalam Extra" w:cs="BRH Malayalam Extra"/>
                 <w:sz w:val="27"/>
                 <w:szCs w:val="40"/>
-              </w:rPr>
-              <w:t>–</w:t>
-            </w:r>
-            <w:r>
-              <w:rPr>
-                <w:rFonts w:ascii="BRH Malayalam Extra" w:hAnsi="BRH Malayalam Extra" w:cs="BRH Malayalam Extra"/>
-                <w:sz w:val="32"/>
-                <w:szCs w:val="40"/>
+                <w:lang w:val="it-IT"/>
+              </w:rPr>
+              <w:t>–</w:t>
+            </w:r>
+            <w:r>
+              <w:rPr>
+                <w:rFonts w:ascii="BRH Malayalam Extra" w:hAnsi="BRH Malayalam Extra" w:cs="BRH Malayalam Extra"/>
+                <w:sz w:val="32"/>
+                <w:szCs w:val="40"/>
+                <w:lang w:val="it-IT"/>
               </w:rPr>
               <w:t>rç</w:t>
             </w:r>
@@ -19056,14 +20725,16 @@
                 <w:rFonts w:ascii="BRH Malayalam Extra" w:hAnsi="BRH Malayalam Extra" w:cs="BRH Malayalam Extra"/>
                 <w:sz w:val="27"/>
                 <w:szCs w:val="40"/>
-              </w:rPr>
-              <w:t>–</w:t>
-            </w:r>
-            <w:r>
-              <w:rPr>
-                <w:rFonts w:ascii="BRH Malayalam Extra" w:hAnsi="BRH Malayalam Extra" w:cs="BRH Malayalam Extra"/>
-                <w:sz w:val="32"/>
-                <w:szCs w:val="40"/>
+                <w:lang w:val="it-IT"/>
+              </w:rPr>
+              <w:t>–</w:t>
+            </w:r>
+            <w:r>
+              <w:rPr>
+                <w:rFonts w:ascii="BRH Malayalam Extra" w:hAnsi="BRH Malayalam Extra" w:cs="BRH Malayalam Extra"/>
+                <w:sz w:val="32"/>
+                <w:szCs w:val="40"/>
+                <w:lang w:val="it-IT"/>
               </w:rPr>
               <w:t>¥Z</w:t>
             </w:r>
@@ -19072,14 +20743,16 @@
                 <w:rFonts w:ascii="BRH Malayalam Extra" w:hAnsi="BRH Malayalam Extra" w:cs="BRH Malayalam Extra"/>
                 <w:sz w:val="27"/>
                 <w:szCs w:val="40"/>
-              </w:rPr>
-              <w:t>–</w:t>
-            </w:r>
-            <w:r>
-              <w:rPr>
-                <w:rFonts w:ascii="BRH Malayalam Extra" w:hAnsi="BRH Malayalam Extra" w:cs="BRH Malayalam Extra"/>
-                <w:sz w:val="32"/>
-                <w:szCs w:val="40"/>
+                <w:lang w:val="it-IT"/>
+              </w:rPr>
+              <w:t>–</w:t>
+            </w:r>
+            <w:r>
+              <w:rPr>
+                <w:rFonts w:ascii="BRH Malayalam Extra" w:hAnsi="BRH Malayalam Extra" w:cs="BRH Malayalam Extra"/>
+                <w:sz w:val="32"/>
+                <w:szCs w:val="40"/>
+                <w:lang w:val="it-IT"/>
               </w:rPr>
               <w:t xml:space="preserve"> | </w:t>
             </w:r>
@@ -19089,6 +20762,7 @@
                 <w:sz w:val="32"/>
                 <w:szCs w:val="40"/>
                 <w:highlight w:val="green"/>
+                <w:lang w:val="it-IT"/>
               </w:rPr>
               <w:t>jx</w:t>
             </w:r>
@@ -19098,14 +20772,16 @@
                 <w:sz w:val="27"/>
                 <w:szCs w:val="40"/>
                 <w:highlight w:val="green"/>
-              </w:rPr>
-              <w:t>–</w:t>
-            </w:r>
-            <w:r>
-              <w:rPr>
-                <w:rFonts w:ascii="BRH Malayalam Extra" w:hAnsi="BRH Malayalam Extra" w:cs="BRH Malayalam Extra"/>
-                <w:sz w:val="32"/>
-                <w:szCs w:val="40"/>
+                <w:lang w:val="it-IT"/>
+              </w:rPr>
+              <w:t>–</w:t>
+            </w:r>
+            <w:r>
+              <w:rPr>
+                <w:rFonts w:ascii="BRH Malayalam Extra" w:hAnsi="BRH Malayalam Extra" w:cs="BRH Malayalam Extra"/>
+                <w:sz w:val="32"/>
+                <w:szCs w:val="40"/>
+                <w:lang w:val="it-IT"/>
               </w:rPr>
               <w:t xml:space="preserve">P§Tx | </w:t>
             </w:r>
@@ -19121,6 +20797,7 @@
                 <w:rFonts w:ascii="BRH Malayalam Extra" w:hAnsi="BRH Malayalam Extra" w:cs="BRH Malayalam Extra"/>
                 <w:sz w:val="32"/>
                 <w:szCs w:val="40"/>
+                <w:lang w:val="it-IT"/>
               </w:rPr>
             </w:pPr>
             <w:r>
@@ -19128,6 +20805,7 @@
                 <w:rFonts w:ascii="BRH Malayalam Extra" w:hAnsi="BRH Malayalam Extra" w:cs="BRH Malayalam Extra"/>
                 <w:sz w:val="32"/>
                 <w:szCs w:val="40"/>
+                <w:lang w:val="it-IT"/>
               </w:rPr>
               <w:t>Zy</w:t>
             </w:r>
@@ -19136,14 +20814,16 @@
                 <w:rFonts w:ascii="BRH Malayalam Extra" w:hAnsi="BRH Malayalam Extra" w:cs="BRH Malayalam Extra"/>
                 <w:sz w:val="27"/>
                 <w:szCs w:val="40"/>
-              </w:rPr>
-              <w:t>–</w:t>
-            </w:r>
-            <w:r>
-              <w:rPr>
-                <w:rFonts w:ascii="BRH Malayalam Extra" w:hAnsi="BRH Malayalam Extra" w:cs="BRH Malayalam Extra"/>
-                <w:sz w:val="32"/>
-                <w:szCs w:val="40"/>
+                <w:lang w:val="it-IT"/>
+              </w:rPr>
+              <w:t>–</w:t>
+            </w:r>
+            <w:r>
+              <w:rPr>
+                <w:rFonts w:ascii="BRH Malayalam Extra" w:hAnsi="BRH Malayalam Extra" w:cs="BRH Malayalam Extra"/>
+                <w:sz w:val="32"/>
+                <w:szCs w:val="40"/>
+                <w:lang w:val="it-IT"/>
               </w:rPr>
               <w:t>rç</w:t>
             </w:r>
@@ -19152,14 +20832,16 @@
                 <w:rFonts w:ascii="BRH Malayalam Extra" w:hAnsi="BRH Malayalam Extra" w:cs="BRH Malayalam Extra"/>
                 <w:sz w:val="27"/>
                 <w:szCs w:val="40"/>
-              </w:rPr>
-              <w:t>–</w:t>
-            </w:r>
-            <w:r>
-              <w:rPr>
-                <w:rFonts w:ascii="BRH Malayalam Extra" w:hAnsi="BRH Malayalam Extra" w:cs="BRH Malayalam Extra"/>
-                <w:sz w:val="32"/>
-                <w:szCs w:val="40"/>
+                <w:lang w:val="it-IT"/>
+              </w:rPr>
+              <w:t>–</w:t>
+            </w:r>
+            <w:r>
+              <w:rPr>
+                <w:rFonts w:ascii="BRH Malayalam Extra" w:hAnsi="BRH Malayalam Extra" w:cs="BRH Malayalam Extra"/>
+                <w:sz w:val="32"/>
+                <w:szCs w:val="40"/>
+                <w:lang w:val="it-IT"/>
               </w:rPr>
               <w:t>¥Z</w:t>
             </w:r>
@@ -19168,14 +20850,16 @@
                 <w:rFonts w:ascii="BRH Malayalam Extra" w:hAnsi="BRH Malayalam Extra" w:cs="BRH Malayalam Extra"/>
                 <w:sz w:val="27"/>
                 <w:szCs w:val="40"/>
-              </w:rPr>
-              <w:t>–</w:t>
-            </w:r>
-            <w:r>
-              <w:rPr>
-                <w:rFonts w:ascii="BRH Malayalam Extra" w:hAnsi="BRH Malayalam Extra" w:cs="BRH Malayalam Extra"/>
-                <w:sz w:val="32"/>
-                <w:szCs w:val="40"/>
+                <w:lang w:val="it-IT"/>
+              </w:rPr>
+              <w:t>–</w:t>
+            </w:r>
+            <w:r>
+              <w:rPr>
+                <w:rFonts w:ascii="BRH Malayalam Extra" w:hAnsi="BRH Malayalam Extra" w:cs="BRH Malayalam Extra"/>
+                <w:sz w:val="32"/>
+                <w:szCs w:val="40"/>
+                <w:lang w:val="it-IT"/>
               </w:rPr>
               <w:t xml:space="preserve"> </w:t>
             </w:r>
@@ -19185,6 +20869,7 @@
                 <w:sz w:val="32"/>
                 <w:szCs w:val="40"/>
                 <w:highlight w:val="green"/>
+                <w:lang w:val="it-IT"/>
               </w:rPr>
               <w:t>jx</w:t>
             </w:r>
@@ -19193,14 +20878,16 @@
                 <w:rFonts w:ascii="BRH Malayalam Extra" w:hAnsi="BRH Malayalam Extra" w:cs="BRH Malayalam Extra"/>
                 <w:sz w:val="27"/>
                 <w:szCs w:val="40"/>
-              </w:rPr>
-              <w:t>–</w:t>
-            </w:r>
-            <w:r>
-              <w:rPr>
-                <w:rFonts w:ascii="BRH Malayalam Extra" w:hAnsi="BRH Malayalam Extra" w:cs="BRH Malayalam Extra"/>
-                <w:sz w:val="32"/>
-                <w:szCs w:val="40"/>
+                <w:lang w:val="it-IT"/>
+              </w:rPr>
+              <w:t>–</w:t>
+            </w:r>
+            <w:r>
+              <w:rPr>
+                <w:rFonts w:ascii="BRH Malayalam Extra" w:hAnsi="BRH Malayalam Extra" w:cs="BRH Malayalam Extra"/>
+                <w:sz w:val="32"/>
+                <w:szCs w:val="40"/>
+                <w:lang w:val="it-IT"/>
               </w:rPr>
               <w:t xml:space="preserve">P§Tx </w:t>
             </w:r>
@@ -19210,6 +20897,7 @@
                 <w:sz w:val="32"/>
                 <w:szCs w:val="40"/>
                 <w:highlight w:val="green"/>
+                <w:lang w:val="it-IT"/>
               </w:rPr>
               <w:t>jx</w:t>
             </w:r>
@@ -19219,14 +20907,16 @@
                 <w:sz w:val="27"/>
                 <w:szCs w:val="40"/>
                 <w:highlight w:val="green"/>
-              </w:rPr>
-              <w:t>–</w:t>
-            </w:r>
-            <w:r>
-              <w:rPr>
-                <w:rFonts w:ascii="BRH Malayalam Extra" w:hAnsi="BRH Malayalam Extra" w:cs="BRH Malayalam Extra"/>
-                <w:sz w:val="32"/>
-                <w:szCs w:val="40"/>
+                <w:lang w:val="it-IT"/>
+              </w:rPr>
+              <w:t>–</w:t>
+            </w:r>
+            <w:r>
+              <w:rPr>
+                <w:rFonts w:ascii="BRH Malayalam Extra" w:hAnsi="BRH Malayalam Extra" w:cs="BRH Malayalam Extra"/>
+                <w:sz w:val="32"/>
+                <w:szCs w:val="40"/>
+                <w:lang w:val="it-IT"/>
               </w:rPr>
               <w:t xml:space="preserve">P§Tx Zy—rç¥Z Zyrç¥Z </w:t>
             </w:r>
@@ -19242,6 +20932,7 @@
                 <w:rFonts w:ascii="BRH Malayalam Extra" w:hAnsi="BRH Malayalam Extra" w:cs="BRH Malayalam Extra"/>
                 <w:sz w:val="32"/>
                 <w:szCs w:val="40"/>
+                <w:lang w:val="it-IT"/>
               </w:rPr>
             </w:pPr>
             <w:r>
@@ -19250,6 +20941,7 @@
                 <w:sz w:val="32"/>
                 <w:szCs w:val="40"/>
                 <w:highlight w:val="green"/>
+                <w:lang w:val="it-IT"/>
               </w:rPr>
               <w:t>jx</w:t>
             </w:r>
@@ -19259,14 +20951,16 @@
                 <w:sz w:val="27"/>
                 <w:szCs w:val="40"/>
                 <w:highlight w:val="green"/>
-              </w:rPr>
-              <w:t>–</w:t>
-            </w:r>
-            <w:r>
-              <w:rPr>
-                <w:rFonts w:ascii="BRH Malayalam Extra" w:hAnsi="BRH Malayalam Extra" w:cs="BRH Malayalam Extra"/>
-                <w:sz w:val="32"/>
-                <w:szCs w:val="40"/>
+                <w:lang w:val="it-IT"/>
+              </w:rPr>
+              <w:t>–</w:t>
+            </w:r>
+            <w:r>
+              <w:rPr>
+                <w:rFonts w:ascii="BRH Malayalam Extra" w:hAnsi="BRH Malayalam Extra" w:cs="BRH Malayalam Extra"/>
+                <w:sz w:val="32"/>
+                <w:szCs w:val="40"/>
+                <w:lang w:val="it-IT"/>
               </w:rPr>
               <w:t xml:space="preserve">P§Tx | </w:t>
             </w:r>
@@ -19282,12 +20976,14 @@
                 <w:rFonts w:ascii="BRH Malayalam Extra" w:hAnsi="BRH Malayalam Extra" w:cs="BRH Malayalam Extra"/>
                 <w:sz w:val="32"/>
                 <w:szCs w:val="40"/>
+                <w:lang w:val="it-IT"/>
               </w:rPr>
             </w:pPr>
             <w:r>
               <w:rPr>
                 <w:rFonts w:cs="BRH Malayalam Extra"/>
                 <w:szCs w:val="40"/>
+                <w:lang w:val="it-IT"/>
               </w:rPr>
               <w:t>7</w:t>
             </w:r>
@@ -19296,6 +20992,7 @@
                 <w:rFonts w:ascii="BRH Malayalam Extra" w:hAnsi="BRH Malayalam Extra" w:cs="BRH Malayalam Extra"/>
                 <w:sz w:val="32"/>
                 <w:szCs w:val="40"/>
+                <w:lang w:val="it-IT"/>
               </w:rPr>
               <w:t>)</w:t>
             </w:r>
@@ -19304,6 +21001,7 @@
                 <w:rFonts w:ascii="BRH Malayalam Extra" w:hAnsi="BRH Malayalam Extra" w:cs="BRH Malayalam Extra"/>
                 <w:sz w:val="32"/>
                 <w:szCs w:val="40"/>
+                <w:lang w:val="it-IT"/>
               </w:rPr>
               <w:tab/>
             </w:r>
@@ -19311,6 +21009,7 @@
               <w:rPr>
                 <w:rFonts w:cs="BRH Malayalam Extra"/>
                 <w:szCs w:val="40"/>
+                <w:lang w:val="it-IT"/>
               </w:rPr>
               <w:t>1</w:t>
             </w:r>
@@ -19319,6 +21018,7 @@
                 <w:rFonts w:ascii="BRH Malayalam Extra" w:hAnsi="BRH Malayalam Extra" w:cs="BRH Malayalam Extra"/>
                 <w:sz w:val="32"/>
                 <w:szCs w:val="40"/>
+                <w:lang w:val="it-IT"/>
               </w:rPr>
               <w:t>.</w:t>
             </w:r>
@@ -19326,6 +21026,7 @@
               <w:rPr>
                 <w:rFonts w:cs="BRH Malayalam Extra"/>
                 <w:szCs w:val="40"/>
+                <w:lang w:val="it-IT"/>
               </w:rPr>
               <w:t>5</w:t>
             </w:r>
@@ -19334,6 +21035,7 @@
                 <w:rFonts w:ascii="BRH Malayalam Extra" w:hAnsi="BRH Malayalam Extra" w:cs="BRH Malayalam Extra"/>
                 <w:sz w:val="32"/>
                 <w:szCs w:val="40"/>
+                <w:lang w:val="it-IT"/>
               </w:rPr>
               <w:t>.</w:t>
             </w:r>
@@ -19341,6 +21043,7 @@
               <w:rPr>
                 <w:rFonts w:cs="BRH Malayalam Extra"/>
                 <w:szCs w:val="40"/>
+                <w:lang w:val="it-IT"/>
               </w:rPr>
               <w:t>7</w:t>
             </w:r>
@@ -19349,6 +21052,7 @@
                 <w:rFonts w:ascii="BRH Malayalam Extra" w:hAnsi="BRH Malayalam Extra" w:cs="BRH Malayalam Extra"/>
                 <w:sz w:val="32"/>
                 <w:szCs w:val="40"/>
+                <w:lang w:val="it-IT"/>
               </w:rPr>
               <w:t>.</w:t>
             </w:r>
@@ -19356,6 +21060,7 @@
               <w:rPr>
                 <w:rFonts w:cs="BRH Malayalam Extra"/>
                 <w:szCs w:val="40"/>
+                <w:lang w:val="it-IT"/>
               </w:rPr>
               <w:t>4</w:t>
             </w:r>
@@ -19364,6 +21069,7 @@
                 <w:rFonts w:ascii="BRH Malayalam Extra" w:hAnsi="BRH Malayalam Extra" w:cs="BRH Malayalam Extra"/>
                 <w:sz w:val="32"/>
                 <w:szCs w:val="40"/>
+                <w:lang w:val="it-IT"/>
               </w:rPr>
               <w:t>(</w:t>
             </w:r>
@@ -19371,6 +21077,7 @@
               <w:rPr>
                 <w:rFonts w:cs="BRH Malayalam Extra"/>
                 <w:szCs w:val="40"/>
+                <w:lang w:val="it-IT"/>
               </w:rPr>
               <w:t>7</w:t>
             </w:r>
@@ -19379,6 +21086,7 @@
                 <w:rFonts w:ascii="BRH Malayalam Extra" w:hAnsi="BRH Malayalam Extra" w:cs="BRH Malayalam Extra"/>
                 <w:sz w:val="32"/>
                 <w:szCs w:val="40"/>
+                <w:lang w:val="it-IT"/>
               </w:rPr>
               <w:t xml:space="preserve">)-  </w:t>
             </w:r>
@@ -19388,6 +21096,7 @@
                 <w:sz w:val="32"/>
                 <w:szCs w:val="40"/>
                 <w:highlight w:val="green"/>
+                <w:lang w:val="it-IT"/>
               </w:rPr>
               <w:t>jx</w:t>
             </w:r>
@@ -19397,14 +21106,16 @@
                 <w:sz w:val="27"/>
                 <w:szCs w:val="40"/>
                 <w:highlight w:val="green"/>
-              </w:rPr>
-              <w:t>–</w:t>
-            </w:r>
-            <w:r>
-              <w:rPr>
-                <w:rFonts w:ascii="BRH Malayalam Extra" w:hAnsi="BRH Malayalam Extra" w:cs="BRH Malayalam Extra"/>
-                <w:sz w:val="32"/>
-                <w:szCs w:val="40"/>
+                <w:lang w:val="it-IT"/>
+              </w:rPr>
+              <w:t>–</w:t>
+            </w:r>
+            <w:r>
+              <w:rPr>
+                <w:rFonts w:ascii="BRH Malayalam Extra" w:hAnsi="BRH Malayalam Extra" w:cs="BRH Malayalam Extra"/>
+                <w:sz w:val="32"/>
+                <w:szCs w:val="40"/>
+                <w:lang w:val="it-IT"/>
               </w:rPr>
               <w:t>P§Tx | G</w:t>
             </w:r>
@@ -19413,14 +21124,16 @@
                 <w:rFonts w:ascii="BRH Malayalam Extra" w:hAnsi="BRH Malayalam Extra" w:cs="BRH Malayalam Extra"/>
                 <w:sz w:val="27"/>
                 <w:szCs w:val="40"/>
-              </w:rPr>
-              <w:t>–</w:t>
-            </w:r>
-            <w:r>
-              <w:rPr>
-                <w:rFonts w:ascii="BRH Malayalam Extra" w:hAnsi="BRH Malayalam Extra" w:cs="BRH Malayalam Extra"/>
-                <w:sz w:val="32"/>
-                <w:szCs w:val="40"/>
+                <w:lang w:val="it-IT"/>
+              </w:rPr>
+              <w:t>–</w:t>
+            </w:r>
+            <w:r>
+              <w:rPr>
+                <w:rFonts w:ascii="BRH Malayalam Extra" w:hAnsi="BRH Malayalam Extra" w:cs="BRH Malayalam Extra"/>
+                <w:sz w:val="32"/>
+                <w:szCs w:val="40"/>
+                <w:lang w:val="it-IT"/>
               </w:rPr>
               <w:t xml:space="preserve">p | </w:t>
             </w:r>
@@ -19435,6 +21148,7 @@
               <w:rPr>
                 <w:rFonts w:cs="BRH Malayalam Extra"/>
                 <w:szCs w:val="40"/>
+                <w:lang w:val="it-IT"/>
               </w:rPr>
             </w:pPr>
             <w:r>
@@ -19443,6 +21157,7 @@
                 <w:sz w:val="32"/>
                 <w:szCs w:val="40"/>
                 <w:highlight w:val="green"/>
+                <w:lang w:val="it-IT"/>
               </w:rPr>
               <w:t>jx</w:t>
             </w:r>
@@ -19451,6 +21166,7 @@
                 <w:rFonts w:ascii="BRH Malayalam Extra" w:hAnsi="BRH Malayalam Extra" w:cs="BRH Malayalam Extra"/>
                 <w:sz w:val="27"/>
                 <w:szCs w:val="40"/>
+                <w:lang w:val="it-IT"/>
               </w:rPr>
               <w:t>–</w:t>
             </w:r>
@@ -19459,6 +21175,7 @@
                 <w:rFonts w:ascii="BRH Malayalam" w:hAnsi="BRH Malayalam" w:cs="BRH Malayalam"/>
                 <w:sz w:val="32"/>
                 <w:szCs w:val="40"/>
+                <w:lang w:val="it-IT"/>
               </w:rPr>
               <w:t xml:space="preserve">P§¤¤T¤¤pp </w:t>
             </w:r>
@@ -19468,6 +21185,7 @@
                 <w:sz w:val="32"/>
                 <w:szCs w:val="40"/>
                 <w:highlight w:val="green"/>
+                <w:lang w:val="it-IT"/>
               </w:rPr>
               <w:t>jx</w:t>
             </w:r>
@@ -19476,6 +21194,7 @@
                 <w:rFonts w:ascii="BRH Malayalam Extra" w:hAnsi="BRH Malayalam Extra" w:cs="BRH Malayalam Extra"/>
                 <w:sz w:val="27"/>
                 <w:szCs w:val="40"/>
+                <w:lang w:val="it-IT"/>
               </w:rPr>
               <w:t>–</w:t>
             </w:r>
@@ -19484,6 +21203,7 @@
                 <w:rFonts w:ascii="BRH Malayalam" w:hAnsi="BRH Malayalam" w:cs="BRH Malayalam"/>
                 <w:sz w:val="32"/>
                 <w:szCs w:val="40"/>
+                <w:lang w:val="it-IT"/>
               </w:rPr>
               <w:t xml:space="preserve">P§Tx </w:t>
             </w:r>
@@ -19493,6 +21213,7 @@
                 <w:sz w:val="32"/>
                 <w:szCs w:val="40"/>
                 <w:highlight w:val="green"/>
+                <w:lang w:val="it-IT"/>
               </w:rPr>
               <w:t>jx</w:t>
             </w:r>
@@ -19502,6 +21223,7 @@
                 <w:sz w:val="27"/>
                 <w:szCs w:val="40"/>
                 <w:highlight w:val="green"/>
+                <w:lang w:val="it-IT"/>
               </w:rPr>
               <w:t>–</w:t>
             </w:r>
@@ -19510,6 +21232,7 @@
                 <w:rFonts w:ascii="BRH Malayalam" w:hAnsi="BRH Malayalam" w:cs="BRH Malayalam"/>
                 <w:sz w:val="32"/>
                 <w:szCs w:val="40"/>
+                <w:lang w:val="it-IT"/>
               </w:rPr>
               <w:t xml:space="preserve">P§¤¤Tp | </w:t>
             </w:r>
@@ -20157,6 +21880,7 @@
                 <w:rFonts w:cs="BRH Malayalam Extra"/>
                 <w:szCs w:val="40"/>
               </w:rPr>
+              <w:lastRenderedPageBreak/>
               <w:t>47</w:t>
             </w:r>
             <w:r>
@@ -22218,7 +23942,6 @@
                 <w:rFonts w:cs="BRH Malayalam Extra"/>
                 <w:szCs w:val="40"/>
               </w:rPr>
-              <w:lastRenderedPageBreak/>
               <w:t>18</w:t>
             </w:r>
             <w:r>
@@ -23580,6 +25303,7 @@
                 <w:rFonts w:cs="BRH Malayalam Extra"/>
                 <w:szCs w:val="40"/>
               </w:rPr>
+              <w:lastRenderedPageBreak/>
               <w:t>17</w:t>
             </w:r>
             <w:r>
@@ -25548,7 +27272,6 @@
                 <w:rFonts w:cs="BRH Malayalam Extra"/>
                 <w:szCs w:val="40"/>
               </w:rPr>
-              <w:lastRenderedPageBreak/>
               <w:t>46</w:t>
             </w:r>
             <w:r>
@@ -26579,6 +28302,7 @@
                 <w:rFonts w:cs="BRH Malayalam Extra"/>
                 <w:szCs w:val="40"/>
               </w:rPr>
+              <w:lastRenderedPageBreak/>
               <w:t>22</w:t>
             </w:r>
             <w:r>
@@ -26848,6 +28572,7 @@
                 <w:rFonts w:cs="BRH Malayalam Extra"/>
                 <w:szCs w:val="40"/>
               </w:rPr>
+              <w:lastRenderedPageBreak/>
               <w:t>20</w:t>
             </w:r>
             <w:r>
@@ -27425,6 +29150,7 @@
                 <w:rFonts w:cs="BRH Malayalam Extra"/>
                 <w:szCs w:val="40"/>
               </w:rPr>
+              <w:lastRenderedPageBreak/>
               <w:t>22</w:t>
             </w:r>
             <w:r>
@@ -27682,6 +29408,7 @@
                 <w:rFonts w:cs="BRH Malayalam Extra"/>
                 <w:szCs w:val="40"/>
               </w:rPr>
+              <w:lastRenderedPageBreak/>
               <w:t>49</w:t>
             </w:r>
             <w:r>
@@ -29091,7 +30818,6 @@
                 <w:rFonts w:cs="BRH Malayalam Extra"/>
                 <w:szCs w:val="40"/>
               </w:rPr>
-              <w:lastRenderedPageBreak/>
               <w:t>35</w:t>
             </w:r>
             <w:r>
@@ -30142,7 +31868,6 @@
                 <w:rFonts w:cs="BRH Malayalam Extra"/>
                 <w:szCs w:val="40"/>
               </w:rPr>
-              <w:lastRenderedPageBreak/>
               <w:t>35</w:t>
             </w:r>
             <w:r>
@@ -32015,7 +33740,25 @@
                 <w:sz w:val="32"/>
                 <w:szCs w:val="40"/>
               </w:rPr>
-              <w:t>(³§—)sy ||</w:t>
+              <w:t>(³§</w:t>
+            </w:r>
+            <w:proofErr w:type="gramStart"/>
+            <w:r>
+              <w:rPr>
+                <w:rFonts w:ascii="BRH Malayalam Extra" w:hAnsi="BRH Malayalam Extra" w:cs="BRH Malayalam Extra"/>
+                <w:sz w:val="32"/>
+                <w:szCs w:val="40"/>
+              </w:rPr>
+              <w:t>—)sy</w:t>
+            </w:r>
+            <w:proofErr w:type="gramEnd"/>
+            <w:r>
+              <w:rPr>
+                <w:rFonts w:ascii="BRH Malayalam Extra" w:hAnsi="BRH Malayalam Extra" w:cs="BRH Malayalam Extra"/>
+                <w:sz w:val="32"/>
+                <w:szCs w:val="40"/>
+              </w:rPr>
+              <w:t xml:space="preserve"> ||</w:t>
             </w:r>
           </w:p>
           <w:p>
@@ -32104,7 +33847,25 @@
                 <w:sz w:val="32"/>
                 <w:szCs w:val="40"/>
               </w:rPr>
-              <w:t xml:space="preserve"> pPx(³§—)sy | </w:t>
+              <w:t xml:space="preserve"> pPx(³§</w:t>
+            </w:r>
+            <w:proofErr w:type="gramStart"/>
+            <w:r>
+              <w:rPr>
+                <w:rFonts w:ascii="BRH Malayalam Extra" w:hAnsi="BRH Malayalam Extra" w:cs="BRH Malayalam Extra"/>
+                <w:sz w:val="32"/>
+                <w:szCs w:val="40"/>
+              </w:rPr>
+              <w:t>—)sy</w:t>
+            </w:r>
+            <w:proofErr w:type="gramEnd"/>
+            <w:r>
+              <w:rPr>
+                <w:rFonts w:ascii="BRH Malayalam Extra" w:hAnsi="BRH Malayalam Extra" w:cs="BRH Malayalam Extra"/>
+                <w:sz w:val="32"/>
+                <w:szCs w:val="40"/>
+              </w:rPr>
+              <w:t xml:space="preserve"> | </w:t>
             </w:r>
           </w:p>
         </w:tc>
@@ -32245,7 +34006,25 @@
                 <w:sz w:val="32"/>
                 <w:szCs w:val="40"/>
               </w:rPr>
-              <w:t>(³§—)sy ||</w:t>
+              <w:t>(³§</w:t>
+            </w:r>
+            <w:proofErr w:type="gramStart"/>
+            <w:r>
+              <w:rPr>
+                <w:rFonts w:ascii="BRH Malayalam Extra" w:hAnsi="BRH Malayalam Extra" w:cs="BRH Malayalam Extra"/>
+                <w:sz w:val="32"/>
+                <w:szCs w:val="40"/>
+              </w:rPr>
+              <w:t>—)sy</w:t>
+            </w:r>
+            <w:proofErr w:type="gramEnd"/>
+            <w:r>
+              <w:rPr>
+                <w:rFonts w:ascii="BRH Malayalam Extra" w:hAnsi="BRH Malayalam Extra" w:cs="BRH Malayalam Extra"/>
+                <w:sz w:val="32"/>
+                <w:szCs w:val="40"/>
+              </w:rPr>
+              <w:t xml:space="preserve"> ||</w:t>
             </w:r>
           </w:p>
           <w:p>
@@ -32325,7 +34104,25 @@
                 <w:sz w:val="32"/>
                 <w:szCs w:val="40"/>
               </w:rPr>
-              <w:t xml:space="preserve"> pPx(³§—)sy | </w:t>
+              <w:t xml:space="preserve"> pPx(³§</w:t>
+            </w:r>
+            <w:proofErr w:type="gramStart"/>
+            <w:r>
+              <w:rPr>
+                <w:rFonts w:ascii="BRH Malayalam Extra" w:hAnsi="BRH Malayalam Extra" w:cs="BRH Malayalam Extra"/>
+                <w:sz w:val="32"/>
+                <w:szCs w:val="40"/>
+              </w:rPr>
+              <w:t>—)sy</w:t>
+            </w:r>
+            <w:proofErr w:type="gramEnd"/>
+            <w:r>
+              <w:rPr>
+                <w:rFonts w:ascii="BRH Malayalam Extra" w:hAnsi="BRH Malayalam Extra" w:cs="BRH Malayalam Extra"/>
+                <w:sz w:val="32"/>
+                <w:szCs w:val="40"/>
+              </w:rPr>
+              <w:t xml:space="preserve"> | </w:t>
             </w:r>
           </w:p>
         </w:tc>
@@ -33932,27 +35729,7 @@
           <w:sz w:val="28"/>
           <w:szCs w:val="32"/>
         </w:rPr>
-        <w:t>(</w:t>
-      </w:r>
-      <w:proofErr w:type="gramStart"/>
-      <w:r>
-        <w:rPr>
-          <w:b/>
-          <w:bCs/>
-          <w:sz w:val="28"/>
-          <w:szCs w:val="32"/>
-        </w:rPr>
-        <w:t>ignore</w:t>
-      </w:r>
-      <w:proofErr w:type="gramEnd"/>
-      <w:r>
-        <w:rPr>
-          <w:b/>
-          <w:bCs/>
-          <w:sz w:val="28"/>
-          <w:szCs w:val="32"/>
-        </w:rPr>
-        <w:t xml:space="preserve"> those which are already incorporated in your book’s version and date)</w:t>
+        <w:t>(ignore those which are already incorporated in your book’s version and date)</w:t>
       </w:r>
     </w:p>
     <w:tbl>
@@ -34224,7 +36001,7 @@
 </file>
 
 <file path=word/endnotes.xml><?xml version="1.0" encoding="utf-8"?>
-<w:endnotes xmlns:wpc="http://schemas.microsoft.com/office/word/2010/wordprocessingCanvas" xmlns:cx="http://schemas.microsoft.com/office/drawing/2014/chartex" xmlns:cx1="http://schemas.microsoft.com/office/drawing/2015/9/8/chartex" xmlns:cx2="http://schemas.microsoft.com/office/drawing/2015/10/21/chartex" xmlns:cx3="http://schemas.microsoft.com/office/drawing/2016/5/9/chartex" xmlns:cx4="http://schemas.microsoft.com/office/drawing/2016/5/10/chartex" xmlns:cx5="http://schemas.microsoft.com/office/drawing/2016/5/11/chartex" xmlns:cx6="http://schemas.microsoft.com/office/drawing/2016/5/12/chartex" xmlns:cx7="http://schemas.microsoft.com/office/drawing/2016/5/13/chartex" xmlns:cx8="http://schemas.microsoft.com/office/drawing/2016/5/14/chartex" xmlns:mc="http://schemas.openxmlformats.org/markup-compatibility/2006" xmlns:aink="http://schemas.microsoft.com/office/drawing/2016/ink" xmlns:am3d="http://schemas.microsoft.com/office/drawing/2017/model3d" xmlns:o="urn:schemas-microsoft-com:office:office" xmlns:oel="http://schemas.microsoft.com/office/2019/extlst" xmlns:r="http://schemas.openxmlformats.org/officeDocument/2006/relationships" xmlns:m="http://schemas.openxmlformats.org/officeDocument/2006/math" xmlns:v="urn:schemas-microsoft-com:vml" xmlns:wp14="http://schemas.microsoft.com/office/word/2010/wordprocessingDrawing" xmlns:wp="http://schemas.openxmlformats.org/drawingml/2006/wordprocessingDrawing" xmlns:w10="urn:schemas-microsoft-com:office:word" xmlns:w="http://schemas.openxmlformats.org/wordprocessingml/2006/main" xmlns:w14="http://schemas.microsoft.com/office/word/2010/wordml" xmlns:w15="http://schemas.microsoft.com/office/word/2012/wordml" xmlns:w16cex="http://schemas.microsoft.com/office/word/2018/wordml/cex" xmlns:w16cid="http://schemas.microsoft.com/office/word/2016/wordml/cid" xmlns:w16="http://schemas.microsoft.com/office/word/2018/wordml" xmlns:w16sdtdh="http://schemas.microsoft.com/office/word/2020/wordml/sdtdatahash" xmlns:w16se="http://schemas.microsoft.com/office/word/2015/wordml/symex" xmlns:wpg="http://schemas.microsoft.com/office/word/2010/wordprocessingGroup" xmlns:wpi="http://schemas.microsoft.com/office/word/2010/wordprocessingInk" xmlns:wne="http://schemas.microsoft.com/office/word/2006/wordml" xmlns:wps="http://schemas.microsoft.com/office/word/2010/wordprocessingShape" mc:Ignorable="w14 w15 w16se w16cid w16 w16cex w16sdtdh wp14">
+<w:endnotes xmlns:wpc="http://schemas.microsoft.com/office/word/2010/wordprocessingCanvas" xmlns:cx="http://schemas.microsoft.com/office/drawing/2014/chartex" xmlns:cx1="http://schemas.microsoft.com/office/drawing/2015/9/8/chartex" xmlns:cx2="http://schemas.microsoft.com/office/drawing/2015/10/21/chartex" xmlns:cx3="http://schemas.microsoft.com/office/drawing/2016/5/9/chartex" xmlns:cx4="http://schemas.microsoft.com/office/drawing/2016/5/10/chartex" xmlns:cx5="http://schemas.microsoft.com/office/drawing/2016/5/11/chartex" xmlns:cx6="http://schemas.microsoft.com/office/drawing/2016/5/12/chartex" xmlns:cx7="http://schemas.microsoft.com/office/drawing/2016/5/13/chartex" xmlns:cx8="http://schemas.microsoft.com/office/drawing/2016/5/14/chartex" xmlns:mc="http://schemas.openxmlformats.org/markup-compatibility/2006" xmlns:aink="http://schemas.microsoft.com/office/drawing/2016/ink" xmlns:am3d="http://schemas.microsoft.com/office/drawing/2017/model3d" xmlns:o="urn:schemas-microsoft-com:office:office" xmlns:oel="http://schemas.microsoft.com/office/2019/extlst" xmlns:r="http://schemas.openxmlformats.org/officeDocument/2006/relationships" xmlns:m="http://schemas.openxmlformats.org/officeDocument/2006/math" xmlns:v="urn:schemas-microsoft-com:vml" xmlns:wp14="http://schemas.microsoft.com/office/word/2010/wordprocessingDrawing" xmlns:wp="http://schemas.openxmlformats.org/drawingml/2006/wordprocessingDrawing" xmlns:w10="urn:schemas-microsoft-com:office:word" xmlns:w="http://schemas.openxmlformats.org/wordprocessingml/2006/main" xmlns:w14="http://schemas.microsoft.com/office/word/2010/wordml" xmlns:w15="http://schemas.microsoft.com/office/word/2012/wordml" xmlns:w16cex="http://schemas.microsoft.com/office/word/2018/wordml/cex" xmlns:w16cid="http://schemas.microsoft.com/office/word/2016/wordml/cid" xmlns:w16="http://schemas.microsoft.com/office/word/2018/wordml" xmlns:w16du="http://schemas.microsoft.com/office/word/2023/wordml/word16du" xmlns:w16sdtdh="http://schemas.microsoft.com/office/word/2020/wordml/sdtdatahash" xmlns:w16sdtfl="http://schemas.microsoft.com/office/word/2024/wordml/sdtformatlock" xmlns:w16se="http://schemas.microsoft.com/office/word/2015/wordml/symex" xmlns:wpg="http://schemas.microsoft.com/office/word/2010/wordprocessingGroup" xmlns:wpi="http://schemas.microsoft.com/office/word/2010/wordprocessingInk" xmlns:wne="http://schemas.microsoft.com/office/word/2006/wordml" xmlns:wps="http://schemas.microsoft.com/office/word/2010/wordprocessingShape" mc:Ignorable="w14 w15 w16se w16cid w16 w16cex w16sdtdh w16sdtfl w16du wp14">
   <w:endnote w:type="separator" w:id="-1">
     <w:p>
       <w:pPr>
@@ -34249,7 +36026,7 @@
 </file>
 
 <file path=word/footer1.xml><?xml version="1.0" encoding="utf-8"?>
-<w:ftr xmlns:wpc="http://schemas.microsoft.com/office/word/2010/wordprocessingCanvas" xmlns:cx="http://schemas.microsoft.com/office/drawing/2014/chartex" xmlns:cx1="http://schemas.microsoft.com/office/drawing/2015/9/8/chartex" xmlns:cx2="http://schemas.microsoft.com/office/drawing/2015/10/21/chartex" xmlns:cx3="http://schemas.microsoft.com/office/drawing/2016/5/9/chartex" xmlns:cx4="http://schemas.microsoft.com/office/drawing/2016/5/10/chartex" xmlns:cx5="http://schemas.microsoft.com/office/drawing/2016/5/11/chartex" xmlns:cx6="http://schemas.microsoft.com/office/drawing/2016/5/12/chartex" xmlns:cx7="http://schemas.microsoft.com/office/drawing/2016/5/13/chartex" xmlns:cx8="http://schemas.microsoft.com/office/drawing/2016/5/14/chartex" xmlns:mc="http://schemas.openxmlformats.org/markup-compatibility/2006" xmlns:aink="http://schemas.microsoft.com/office/drawing/2016/ink" xmlns:am3d="http://schemas.microsoft.com/office/drawing/2017/model3d" xmlns:o="urn:schemas-microsoft-com:office:office" xmlns:oel="http://schemas.microsoft.com/office/2019/extlst" xmlns:r="http://schemas.openxmlformats.org/officeDocument/2006/relationships" xmlns:m="http://schemas.openxmlformats.org/officeDocument/2006/math" xmlns:v="urn:schemas-microsoft-com:vml" xmlns:wp14="http://schemas.microsoft.com/office/word/2010/wordprocessingDrawing" xmlns:wp="http://schemas.openxmlformats.org/drawingml/2006/wordprocessingDrawing" xmlns:w10="urn:schemas-microsoft-com:office:word" xmlns:w="http://schemas.openxmlformats.org/wordprocessingml/2006/main" xmlns:w14="http://schemas.microsoft.com/office/word/2010/wordml" xmlns:w15="http://schemas.microsoft.com/office/word/2012/wordml" xmlns:w16cex="http://schemas.microsoft.com/office/word/2018/wordml/cex" xmlns:w16cid="http://schemas.microsoft.com/office/word/2016/wordml/cid" xmlns:w16="http://schemas.microsoft.com/office/word/2018/wordml" xmlns:w16sdtdh="http://schemas.microsoft.com/office/word/2020/wordml/sdtdatahash" xmlns:w16se="http://schemas.microsoft.com/office/word/2015/wordml/symex" xmlns:wpg="http://schemas.microsoft.com/office/word/2010/wordprocessingGroup" xmlns:wpi="http://schemas.microsoft.com/office/word/2010/wordprocessingInk" xmlns:wne="http://schemas.microsoft.com/office/word/2006/wordml" xmlns:wps="http://schemas.microsoft.com/office/word/2010/wordprocessingShape" mc:Ignorable="w14 w15 w16se w16cid w16 w16cex w16sdtdh wp14">
+<w:ftr xmlns:wpc="http://schemas.microsoft.com/office/word/2010/wordprocessingCanvas" xmlns:cx="http://schemas.microsoft.com/office/drawing/2014/chartex" xmlns:cx1="http://schemas.microsoft.com/office/drawing/2015/9/8/chartex" xmlns:cx2="http://schemas.microsoft.com/office/drawing/2015/10/21/chartex" xmlns:cx3="http://schemas.microsoft.com/office/drawing/2016/5/9/chartex" xmlns:cx4="http://schemas.microsoft.com/office/drawing/2016/5/10/chartex" xmlns:cx5="http://schemas.microsoft.com/office/drawing/2016/5/11/chartex" xmlns:cx6="http://schemas.microsoft.com/office/drawing/2016/5/12/chartex" xmlns:cx7="http://schemas.microsoft.com/office/drawing/2016/5/13/chartex" xmlns:cx8="http://schemas.microsoft.com/office/drawing/2016/5/14/chartex" xmlns:mc="http://schemas.openxmlformats.org/markup-compatibility/2006" xmlns:aink="http://schemas.microsoft.com/office/drawing/2016/ink" xmlns:am3d="http://schemas.microsoft.com/office/drawing/2017/model3d" xmlns:o="urn:schemas-microsoft-com:office:office" xmlns:oel="http://schemas.microsoft.com/office/2019/extlst" xmlns:r="http://schemas.openxmlformats.org/officeDocument/2006/relationships" xmlns:m="http://schemas.openxmlformats.org/officeDocument/2006/math" xmlns:v="urn:schemas-microsoft-com:vml" xmlns:wp14="http://schemas.microsoft.com/office/word/2010/wordprocessingDrawing" xmlns:wp="http://schemas.openxmlformats.org/drawingml/2006/wordprocessingDrawing" xmlns:w10="urn:schemas-microsoft-com:office:word" xmlns:w="http://schemas.openxmlformats.org/wordprocessingml/2006/main" xmlns:w14="http://schemas.microsoft.com/office/word/2010/wordml" xmlns:w15="http://schemas.microsoft.com/office/word/2012/wordml" xmlns:w16cex="http://schemas.microsoft.com/office/word/2018/wordml/cex" xmlns:w16cid="http://schemas.microsoft.com/office/word/2016/wordml/cid" xmlns:w16="http://schemas.microsoft.com/office/word/2018/wordml" xmlns:w16du="http://schemas.microsoft.com/office/word/2023/wordml/word16du" xmlns:w16sdtdh="http://schemas.microsoft.com/office/word/2020/wordml/sdtdatahash" xmlns:w16sdtfl="http://schemas.microsoft.com/office/word/2024/wordml/sdtformatlock" xmlns:w16se="http://schemas.microsoft.com/office/word/2015/wordml/symex" xmlns:wpg="http://schemas.microsoft.com/office/word/2010/wordprocessingGroup" xmlns:wpi="http://schemas.microsoft.com/office/word/2010/wordprocessingInk" xmlns:wne="http://schemas.microsoft.com/office/word/2006/wordml" xmlns:wps="http://schemas.microsoft.com/office/word/2010/wordprocessingShape" mc:Ignorable="w14 w15 w16se w16cid w16 w16cex w16sdtdh w16sdtfl w16du wp14">
   <w:p>
     <w:pPr>
       <w:pBdr>
@@ -34431,7 +36208,7 @@
 </file>
 
 <file path=word/footer2.xml><?xml version="1.0" encoding="utf-8"?>
-<w:ftr xmlns:wpc="http://schemas.microsoft.com/office/word/2010/wordprocessingCanvas" xmlns:cx="http://schemas.microsoft.com/office/drawing/2014/chartex" xmlns:cx1="http://schemas.microsoft.com/office/drawing/2015/9/8/chartex" xmlns:cx2="http://schemas.microsoft.com/office/drawing/2015/10/21/chartex" xmlns:cx3="http://schemas.microsoft.com/office/drawing/2016/5/9/chartex" xmlns:cx4="http://schemas.microsoft.com/office/drawing/2016/5/10/chartex" xmlns:cx5="http://schemas.microsoft.com/office/drawing/2016/5/11/chartex" xmlns:cx6="http://schemas.microsoft.com/office/drawing/2016/5/12/chartex" xmlns:cx7="http://schemas.microsoft.com/office/drawing/2016/5/13/chartex" xmlns:cx8="http://schemas.microsoft.com/office/drawing/2016/5/14/chartex" xmlns:mc="http://schemas.openxmlformats.org/markup-compatibility/2006" xmlns:aink="http://schemas.microsoft.com/office/drawing/2016/ink" xmlns:am3d="http://schemas.microsoft.com/office/drawing/2017/model3d" xmlns:o="urn:schemas-microsoft-com:office:office" xmlns:oel="http://schemas.microsoft.com/office/2019/extlst" xmlns:r="http://schemas.openxmlformats.org/officeDocument/2006/relationships" xmlns:m="http://schemas.openxmlformats.org/officeDocument/2006/math" xmlns:v="urn:schemas-microsoft-com:vml" xmlns:wp14="http://schemas.microsoft.com/office/word/2010/wordprocessingDrawing" xmlns:wp="http://schemas.openxmlformats.org/drawingml/2006/wordprocessingDrawing" xmlns:w10="urn:schemas-microsoft-com:office:word" xmlns:w="http://schemas.openxmlformats.org/wordprocessingml/2006/main" xmlns:w14="http://schemas.microsoft.com/office/word/2010/wordml" xmlns:w15="http://schemas.microsoft.com/office/word/2012/wordml" xmlns:w16cex="http://schemas.microsoft.com/office/word/2018/wordml/cex" xmlns:w16cid="http://schemas.microsoft.com/office/word/2016/wordml/cid" xmlns:w16="http://schemas.microsoft.com/office/word/2018/wordml" xmlns:w16sdtdh="http://schemas.microsoft.com/office/word/2020/wordml/sdtdatahash" xmlns:w16se="http://schemas.microsoft.com/office/word/2015/wordml/symex" xmlns:wpg="http://schemas.microsoft.com/office/word/2010/wordprocessingGroup" xmlns:wpi="http://schemas.microsoft.com/office/word/2010/wordprocessingInk" xmlns:wne="http://schemas.microsoft.com/office/word/2006/wordml" xmlns:wps="http://schemas.microsoft.com/office/word/2010/wordprocessingShape" mc:Ignorable="w14 w15 w16se w16cid w16 w16cex w16sdtdh wp14">
+<w:ftr xmlns:wpc="http://schemas.microsoft.com/office/word/2010/wordprocessingCanvas" xmlns:cx="http://schemas.microsoft.com/office/drawing/2014/chartex" xmlns:cx1="http://schemas.microsoft.com/office/drawing/2015/9/8/chartex" xmlns:cx2="http://schemas.microsoft.com/office/drawing/2015/10/21/chartex" xmlns:cx3="http://schemas.microsoft.com/office/drawing/2016/5/9/chartex" xmlns:cx4="http://schemas.microsoft.com/office/drawing/2016/5/10/chartex" xmlns:cx5="http://schemas.microsoft.com/office/drawing/2016/5/11/chartex" xmlns:cx6="http://schemas.microsoft.com/office/drawing/2016/5/12/chartex" xmlns:cx7="http://schemas.microsoft.com/office/drawing/2016/5/13/chartex" xmlns:cx8="http://schemas.microsoft.com/office/drawing/2016/5/14/chartex" xmlns:mc="http://schemas.openxmlformats.org/markup-compatibility/2006" xmlns:aink="http://schemas.microsoft.com/office/drawing/2016/ink" xmlns:am3d="http://schemas.microsoft.com/office/drawing/2017/model3d" xmlns:o="urn:schemas-microsoft-com:office:office" xmlns:oel="http://schemas.microsoft.com/office/2019/extlst" xmlns:r="http://schemas.openxmlformats.org/officeDocument/2006/relationships" xmlns:m="http://schemas.openxmlformats.org/officeDocument/2006/math" xmlns:v="urn:schemas-microsoft-com:vml" xmlns:wp14="http://schemas.microsoft.com/office/word/2010/wordprocessingDrawing" xmlns:wp="http://schemas.openxmlformats.org/drawingml/2006/wordprocessingDrawing" xmlns:w10="urn:schemas-microsoft-com:office:word" xmlns:w="http://schemas.openxmlformats.org/wordprocessingml/2006/main" xmlns:w14="http://schemas.microsoft.com/office/word/2010/wordml" xmlns:w15="http://schemas.microsoft.com/office/word/2012/wordml" xmlns:w16cex="http://schemas.microsoft.com/office/word/2018/wordml/cex" xmlns:w16cid="http://schemas.microsoft.com/office/word/2016/wordml/cid" xmlns:w16="http://schemas.microsoft.com/office/word/2018/wordml" xmlns:w16du="http://schemas.microsoft.com/office/word/2023/wordml/word16du" xmlns:w16sdtdh="http://schemas.microsoft.com/office/word/2020/wordml/sdtdatahash" xmlns:w16sdtfl="http://schemas.microsoft.com/office/word/2024/wordml/sdtformatlock" xmlns:w16se="http://schemas.microsoft.com/office/word/2015/wordml/symex" xmlns:wpg="http://schemas.microsoft.com/office/word/2010/wordprocessingGroup" xmlns:wpi="http://schemas.microsoft.com/office/word/2010/wordprocessingInk" xmlns:wne="http://schemas.microsoft.com/office/word/2006/wordml" xmlns:wps="http://schemas.microsoft.com/office/word/2010/wordprocessingShape" mc:Ignorable="w14 w15 w16se w16cid w16 w16cex w16sdtdh w16sdtfl w16du wp14">
   <w:p>
     <w:pPr>
       <w:pBdr>
@@ -34637,7 +36414,7 @@
 </file>
 
 <file path=word/footnotes.xml><?xml version="1.0" encoding="utf-8"?>
-<w:footnotes xmlns:wpc="http://schemas.microsoft.com/office/word/2010/wordprocessingCanvas" xmlns:cx="http://schemas.microsoft.com/office/drawing/2014/chartex" xmlns:cx1="http://schemas.microsoft.com/office/drawing/2015/9/8/chartex" xmlns:cx2="http://schemas.microsoft.com/office/drawing/2015/10/21/chartex" xmlns:cx3="http://schemas.microsoft.com/office/drawing/2016/5/9/chartex" xmlns:cx4="http://schemas.microsoft.com/office/drawing/2016/5/10/chartex" xmlns:cx5="http://schemas.microsoft.com/office/drawing/2016/5/11/chartex" xmlns:cx6="http://schemas.microsoft.com/office/drawing/2016/5/12/chartex" xmlns:cx7="http://schemas.microsoft.com/office/drawing/2016/5/13/chartex" xmlns:cx8="http://schemas.microsoft.com/office/drawing/2016/5/14/chartex" xmlns:mc="http://schemas.openxmlformats.org/markup-compatibility/2006" xmlns:aink="http://schemas.microsoft.com/office/drawing/2016/ink" xmlns:am3d="http://schemas.microsoft.com/office/drawing/2017/model3d" xmlns:o="urn:schemas-microsoft-com:office:office" xmlns:oel="http://schemas.microsoft.com/office/2019/extlst" xmlns:r="http://schemas.openxmlformats.org/officeDocument/2006/relationships" xmlns:m="http://schemas.openxmlformats.org/officeDocument/2006/math" xmlns:v="urn:schemas-microsoft-com:vml" xmlns:wp14="http://schemas.microsoft.com/office/word/2010/wordprocessingDrawing" xmlns:wp="http://schemas.openxmlformats.org/drawingml/2006/wordprocessingDrawing" xmlns:w10="urn:schemas-microsoft-com:office:word" xmlns:w="http://schemas.openxmlformats.org/wordprocessingml/2006/main" xmlns:w14="http://schemas.microsoft.com/office/word/2010/wordml" xmlns:w15="http://schemas.microsoft.com/office/word/2012/wordml" xmlns:w16cex="http://schemas.microsoft.com/office/word/2018/wordml/cex" xmlns:w16cid="http://schemas.microsoft.com/office/word/2016/wordml/cid" xmlns:w16="http://schemas.microsoft.com/office/word/2018/wordml" xmlns:w16sdtdh="http://schemas.microsoft.com/office/word/2020/wordml/sdtdatahash" xmlns:w16se="http://schemas.microsoft.com/office/word/2015/wordml/symex" xmlns:wpg="http://schemas.microsoft.com/office/word/2010/wordprocessingGroup" xmlns:wpi="http://schemas.microsoft.com/office/word/2010/wordprocessingInk" xmlns:wne="http://schemas.microsoft.com/office/word/2006/wordml" xmlns:wps="http://schemas.microsoft.com/office/word/2010/wordprocessingShape" mc:Ignorable="w14 w15 w16se w16cid w16 w16cex w16sdtdh wp14">
+<w:footnotes xmlns:wpc="http://schemas.microsoft.com/office/word/2010/wordprocessingCanvas" xmlns:cx="http://schemas.microsoft.com/office/drawing/2014/chartex" xmlns:cx1="http://schemas.microsoft.com/office/drawing/2015/9/8/chartex" xmlns:cx2="http://schemas.microsoft.com/office/drawing/2015/10/21/chartex" xmlns:cx3="http://schemas.microsoft.com/office/drawing/2016/5/9/chartex" xmlns:cx4="http://schemas.microsoft.com/office/drawing/2016/5/10/chartex" xmlns:cx5="http://schemas.microsoft.com/office/drawing/2016/5/11/chartex" xmlns:cx6="http://schemas.microsoft.com/office/drawing/2016/5/12/chartex" xmlns:cx7="http://schemas.microsoft.com/office/drawing/2016/5/13/chartex" xmlns:cx8="http://schemas.microsoft.com/office/drawing/2016/5/14/chartex" xmlns:mc="http://schemas.openxmlformats.org/markup-compatibility/2006" xmlns:aink="http://schemas.microsoft.com/office/drawing/2016/ink" xmlns:am3d="http://schemas.microsoft.com/office/drawing/2017/model3d" xmlns:o="urn:schemas-microsoft-com:office:office" xmlns:oel="http://schemas.microsoft.com/office/2019/extlst" xmlns:r="http://schemas.openxmlformats.org/officeDocument/2006/relationships" xmlns:m="http://schemas.openxmlformats.org/officeDocument/2006/math" xmlns:v="urn:schemas-microsoft-com:vml" xmlns:wp14="http://schemas.microsoft.com/office/word/2010/wordprocessingDrawing" xmlns:wp="http://schemas.openxmlformats.org/drawingml/2006/wordprocessingDrawing" xmlns:w10="urn:schemas-microsoft-com:office:word" xmlns:w="http://schemas.openxmlformats.org/wordprocessingml/2006/main" xmlns:w14="http://schemas.microsoft.com/office/word/2010/wordml" xmlns:w15="http://schemas.microsoft.com/office/word/2012/wordml" xmlns:w16cex="http://schemas.microsoft.com/office/word/2018/wordml/cex" xmlns:w16cid="http://schemas.microsoft.com/office/word/2016/wordml/cid" xmlns:w16="http://schemas.microsoft.com/office/word/2018/wordml" xmlns:w16du="http://schemas.microsoft.com/office/word/2023/wordml/word16du" xmlns:w16sdtdh="http://schemas.microsoft.com/office/word/2020/wordml/sdtdatahash" xmlns:w16sdtfl="http://schemas.microsoft.com/office/word/2024/wordml/sdtformatlock" xmlns:w16se="http://schemas.microsoft.com/office/word/2015/wordml/symex" xmlns:wpg="http://schemas.microsoft.com/office/word/2010/wordprocessingGroup" xmlns:wpi="http://schemas.microsoft.com/office/word/2010/wordprocessingInk" xmlns:wne="http://schemas.microsoft.com/office/word/2006/wordml" xmlns:wps="http://schemas.microsoft.com/office/word/2010/wordprocessingShape" mc:Ignorable="w14 w15 w16se w16cid w16 w16cex w16sdtdh w16sdtfl w16du wp14">
   <w:footnote w:type="separator" w:id="-1">
     <w:p>
       <w:pPr>
@@ -34662,7 +36439,7 @@
 </file>
 
 <file path=word/header1.xml><?xml version="1.0" encoding="utf-8"?>
-<w:hdr xmlns:wpc="http://schemas.microsoft.com/office/word/2010/wordprocessingCanvas" xmlns:cx="http://schemas.microsoft.com/office/drawing/2014/chartex" xmlns:cx1="http://schemas.microsoft.com/office/drawing/2015/9/8/chartex" xmlns:cx2="http://schemas.microsoft.com/office/drawing/2015/10/21/chartex" xmlns:cx3="http://schemas.microsoft.com/office/drawing/2016/5/9/chartex" xmlns:cx4="http://schemas.microsoft.com/office/drawing/2016/5/10/chartex" xmlns:cx5="http://schemas.microsoft.com/office/drawing/2016/5/11/chartex" xmlns:cx6="http://schemas.microsoft.com/office/drawing/2016/5/12/chartex" xmlns:cx7="http://schemas.microsoft.com/office/drawing/2016/5/13/chartex" xmlns:cx8="http://schemas.microsoft.com/office/drawing/2016/5/14/chartex" xmlns:mc="http://schemas.openxmlformats.org/markup-compatibility/2006" xmlns:aink="http://schemas.microsoft.com/office/drawing/2016/ink" xmlns:am3d="http://schemas.microsoft.com/office/drawing/2017/model3d" xmlns:o="urn:schemas-microsoft-com:office:office" xmlns:oel="http://schemas.microsoft.com/office/2019/extlst" xmlns:r="http://schemas.openxmlformats.org/officeDocument/2006/relationships" xmlns:m="http://schemas.openxmlformats.org/officeDocument/2006/math" xmlns:v="urn:schemas-microsoft-com:vml" xmlns:wp14="http://schemas.microsoft.com/office/word/2010/wordprocessingDrawing" xmlns:wp="http://schemas.openxmlformats.org/drawingml/2006/wordprocessingDrawing" xmlns:w10="urn:schemas-microsoft-com:office:word" xmlns:w="http://schemas.openxmlformats.org/wordprocessingml/2006/main" xmlns:w14="http://schemas.microsoft.com/office/word/2010/wordml" xmlns:w15="http://schemas.microsoft.com/office/word/2012/wordml" xmlns:w16cex="http://schemas.microsoft.com/office/word/2018/wordml/cex" xmlns:w16cid="http://schemas.microsoft.com/office/word/2016/wordml/cid" xmlns:w16="http://schemas.microsoft.com/office/word/2018/wordml" xmlns:w16sdtdh="http://schemas.microsoft.com/office/word/2020/wordml/sdtdatahash" xmlns:w16se="http://schemas.microsoft.com/office/word/2015/wordml/symex" xmlns:wpg="http://schemas.microsoft.com/office/word/2010/wordprocessingGroup" xmlns:wpi="http://schemas.microsoft.com/office/word/2010/wordprocessingInk" xmlns:wne="http://schemas.microsoft.com/office/word/2006/wordml" xmlns:wps="http://schemas.microsoft.com/office/word/2010/wordprocessingShape" mc:Ignorable="w14 w15 w16se w16cid w16 w16cex w16sdtdh wp14">
+<w:hdr xmlns:wpc="http://schemas.microsoft.com/office/word/2010/wordprocessingCanvas" xmlns:cx="http://schemas.microsoft.com/office/drawing/2014/chartex" xmlns:cx1="http://schemas.microsoft.com/office/drawing/2015/9/8/chartex" xmlns:cx2="http://schemas.microsoft.com/office/drawing/2015/10/21/chartex" xmlns:cx3="http://schemas.microsoft.com/office/drawing/2016/5/9/chartex" xmlns:cx4="http://schemas.microsoft.com/office/drawing/2016/5/10/chartex" xmlns:cx5="http://schemas.microsoft.com/office/drawing/2016/5/11/chartex" xmlns:cx6="http://schemas.microsoft.com/office/drawing/2016/5/12/chartex" xmlns:cx7="http://schemas.microsoft.com/office/drawing/2016/5/13/chartex" xmlns:cx8="http://schemas.microsoft.com/office/drawing/2016/5/14/chartex" xmlns:mc="http://schemas.openxmlformats.org/markup-compatibility/2006" xmlns:aink="http://schemas.microsoft.com/office/drawing/2016/ink" xmlns:am3d="http://schemas.microsoft.com/office/drawing/2017/model3d" xmlns:o="urn:schemas-microsoft-com:office:office" xmlns:oel="http://schemas.microsoft.com/office/2019/extlst" xmlns:r="http://schemas.openxmlformats.org/officeDocument/2006/relationships" xmlns:m="http://schemas.openxmlformats.org/officeDocument/2006/math" xmlns:v="urn:schemas-microsoft-com:vml" xmlns:wp14="http://schemas.microsoft.com/office/word/2010/wordprocessingDrawing" xmlns:wp="http://schemas.openxmlformats.org/drawingml/2006/wordprocessingDrawing" xmlns:w10="urn:schemas-microsoft-com:office:word" xmlns:w="http://schemas.openxmlformats.org/wordprocessingml/2006/main" xmlns:w14="http://schemas.microsoft.com/office/word/2010/wordml" xmlns:w15="http://schemas.microsoft.com/office/word/2012/wordml" xmlns:w16cex="http://schemas.microsoft.com/office/word/2018/wordml/cex" xmlns:w16cid="http://schemas.microsoft.com/office/word/2016/wordml/cid" xmlns:w16="http://schemas.microsoft.com/office/word/2018/wordml" xmlns:w16du="http://schemas.microsoft.com/office/word/2023/wordml/word16du" xmlns:w16sdtdh="http://schemas.microsoft.com/office/word/2020/wordml/sdtdatahash" xmlns:w16sdtfl="http://schemas.microsoft.com/office/word/2024/wordml/sdtformatlock" xmlns:w16se="http://schemas.microsoft.com/office/word/2015/wordml/symex" xmlns:wpg="http://schemas.microsoft.com/office/word/2010/wordprocessingGroup" xmlns:wpi="http://schemas.microsoft.com/office/word/2010/wordprocessingInk" xmlns:wne="http://schemas.microsoft.com/office/word/2006/wordml" xmlns:wps="http://schemas.microsoft.com/office/word/2010/wordprocessingShape" mc:Ignorable="w14 w15 w16se w16cid w16 w16cex w16sdtdh w16sdtfl w16du wp14">
   <w:p>
     <w:pPr>
       <w:pStyle w:val="Header"/>
@@ -34683,7 +36460,7 @@
 </file>
 
 <file path=word/header2.xml><?xml version="1.0" encoding="utf-8"?>
-<w:hdr xmlns:wpc="http://schemas.microsoft.com/office/word/2010/wordprocessingCanvas" xmlns:cx="http://schemas.microsoft.com/office/drawing/2014/chartex" xmlns:cx1="http://schemas.microsoft.com/office/drawing/2015/9/8/chartex" xmlns:cx2="http://schemas.microsoft.com/office/drawing/2015/10/21/chartex" xmlns:cx3="http://schemas.microsoft.com/office/drawing/2016/5/9/chartex" xmlns:cx4="http://schemas.microsoft.com/office/drawing/2016/5/10/chartex" xmlns:cx5="http://schemas.microsoft.com/office/drawing/2016/5/11/chartex" xmlns:cx6="http://schemas.microsoft.com/office/drawing/2016/5/12/chartex" xmlns:cx7="http://schemas.microsoft.com/office/drawing/2016/5/13/chartex" xmlns:cx8="http://schemas.microsoft.com/office/drawing/2016/5/14/chartex" xmlns:mc="http://schemas.openxmlformats.org/markup-compatibility/2006" xmlns:aink="http://schemas.microsoft.com/office/drawing/2016/ink" xmlns:am3d="http://schemas.microsoft.com/office/drawing/2017/model3d" xmlns:o="urn:schemas-microsoft-com:office:office" xmlns:oel="http://schemas.microsoft.com/office/2019/extlst" xmlns:r="http://schemas.openxmlformats.org/officeDocument/2006/relationships" xmlns:m="http://schemas.openxmlformats.org/officeDocument/2006/math" xmlns:v="urn:schemas-microsoft-com:vml" xmlns:wp14="http://schemas.microsoft.com/office/word/2010/wordprocessingDrawing" xmlns:wp="http://schemas.openxmlformats.org/drawingml/2006/wordprocessingDrawing" xmlns:w10="urn:schemas-microsoft-com:office:word" xmlns:w="http://schemas.openxmlformats.org/wordprocessingml/2006/main" xmlns:w14="http://schemas.microsoft.com/office/word/2010/wordml" xmlns:w15="http://schemas.microsoft.com/office/word/2012/wordml" xmlns:w16cex="http://schemas.microsoft.com/office/word/2018/wordml/cex" xmlns:w16cid="http://schemas.microsoft.com/office/word/2016/wordml/cid" xmlns:w16="http://schemas.microsoft.com/office/word/2018/wordml" xmlns:w16sdtdh="http://schemas.microsoft.com/office/word/2020/wordml/sdtdatahash" xmlns:w16se="http://schemas.microsoft.com/office/word/2015/wordml/symex" xmlns:wpg="http://schemas.microsoft.com/office/word/2010/wordprocessingGroup" xmlns:wpi="http://schemas.microsoft.com/office/word/2010/wordprocessingInk" xmlns:wne="http://schemas.microsoft.com/office/word/2006/wordml" xmlns:wps="http://schemas.microsoft.com/office/word/2010/wordprocessingShape" mc:Ignorable="w14 w15 w16se w16cid w16 w16cex w16sdtdh wp14">
+<w:hdr xmlns:wpc="http://schemas.microsoft.com/office/word/2010/wordprocessingCanvas" xmlns:cx="http://schemas.microsoft.com/office/drawing/2014/chartex" xmlns:cx1="http://schemas.microsoft.com/office/drawing/2015/9/8/chartex" xmlns:cx2="http://schemas.microsoft.com/office/drawing/2015/10/21/chartex" xmlns:cx3="http://schemas.microsoft.com/office/drawing/2016/5/9/chartex" xmlns:cx4="http://schemas.microsoft.com/office/drawing/2016/5/10/chartex" xmlns:cx5="http://schemas.microsoft.com/office/drawing/2016/5/11/chartex" xmlns:cx6="http://schemas.microsoft.com/office/drawing/2016/5/12/chartex" xmlns:cx7="http://schemas.microsoft.com/office/drawing/2016/5/13/chartex" xmlns:cx8="http://schemas.microsoft.com/office/drawing/2016/5/14/chartex" xmlns:mc="http://schemas.openxmlformats.org/markup-compatibility/2006" xmlns:aink="http://schemas.microsoft.com/office/drawing/2016/ink" xmlns:am3d="http://schemas.microsoft.com/office/drawing/2017/model3d" xmlns:o="urn:schemas-microsoft-com:office:office" xmlns:oel="http://schemas.microsoft.com/office/2019/extlst" xmlns:r="http://schemas.openxmlformats.org/officeDocument/2006/relationships" xmlns:m="http://schemas.openxmlformats.org/officeDocument/2006/math" xmlns:v="urn:schemas-microsoft-com:vml" xmlns:wp14="http://schemas.microsoft.com/office/word/2010/wordprocessingDrawing" xmlns:wp="http://schemas.openxmlformats.org/drawingml/2006/wordprocessingDrawing" xmlns:w10="urn:schemas-microsoft-com:office:word" xmlns:w="http://schemas.openxmlformats.org/wordprocessingml/2006/main" xmlns:w14="http://schemas.microsoft.com/office/word/2010/wordml" xmlns:w15="http://schemas.microsoft.com/office/word/2012/wordml" xmlns:w16cex="http://schemas.microsoft.com/office/word/2018/wordml/cex" xmlns:w16cid="http://schemas.microsoft.com/office/word/2016/wordml/cid" xmlns:w16="http://schemas.microsoft.com/office/word/2018/wordml" xmlns:w16du="http://schemas.microsoft.com/office/word/2023/wordml/word16du" xmlns:w16sdtdh="http://schemas.microsoft.com/office/word/2020/wordml/sdtdatahash" xmlns:w16sdtfl="http://schemas.microsoft.com/office/word/2024/wordml/sdtformatlock" xmlns:w16se="http://schemas.microsoft.com/office/word/2015/wordml/symex" xmlns:wpg="http://schemas.microsoft.com/office/word/2010/wordprocessingGroup" xmlns:wpi="http://schemas.microsoft.com/office/word/2010/wordprocessingInk" xmlns:wne="http://schemas.microsoft.com/office/word/2006/wordml" xmlns:wps="http://schemas.microsoft.com/office/word/2010/wordprocessingShape" mc:Ignorable="w14 w15 w16se w16cid w16 w16cex w16sdtdh w16sdtfl w16du wp14">
   <w:p>
     <w:pPr>
       <w:pStyle w:val="Header"/>
@@ -34696,7 +36473,7 @@
 </file>
 
 <file path=word/styles.xml><?xml version="1.0" encoding="utf-8"?>
-<w:styles xmlns:mc="http://schemas.openxmlformats.org/markup-compatibility/2006" xmlns:r="http://schemas.openxmlformats.org/officeDocument/2006/relationships" xmlns:w="http://schemas.openxmlformats.org/wordprocessingml/2006/main" xmlns:w14="http://schemas.microsoft.com/office/word/2010/wordml" xmlns:w15="http://schemas.microsoft.com/office/word/2012/wordml" xmlns:w16cex="http://schemas.microsoft.com/office/word/2018/wordml/cex" xmlns:w16cid="http://schemas.microsoft.com/office/word/2016/wordml/cid" xmlns:w16="http://schemas.microsoft.com/office/word/2018/wordml" xmlns:w16sdtdh="http://schemas.microsoft.com/office/word/2020/wordml/sdtdatahash" xmlns:w16se="http://schemas.microsoft.com/office/word/2015/wordml/symex" mc:Ignorable="w14 w15 w16se w16cid w16 w16cex w16sdtdh">
+<w:styles xmlns:mc="http://schemas.openxmlformats.org/markup-compatibility/2006" xmlns:r="http://schemas.openxmlformats.org/officeDocument/2006/relationships" xmlns:w="http://schemas.openxmlformats.org/wordprocessingml/2006/main" xmlns:w14="http://schemas.microsoft.com/office/word/2010/wordml" xmlns:w15="http://schemas.microsoft.com/office/word/2012/wordml" xmlns:w16cex="http://schemas.microsoft.com/office/word/2018/wordml/cex" xmlns:w16cid="http://schemas.microsoft.com/office/word/2016/wordml/cid" xmlns:w16="http://schemas.microsoft.com/office/word/2018/wordml" xmlns:w16du="http://schemas.microsoft.com/office/word/2023/wordml/word16du" xmlns:w16sdtdh="http://schemas.microsoft.com/office/word/2020/wordml/sdtdatahash" xmlns:w16sdtfl="http://schemas.microsoft.com/office/word/2024/wordml/sdtformatlock" xmlns:w16se="http://schemas.microsoft.com/office/word/2015/wordml/symex" mc:Ignorable="w14 w15 w16se w16cid w16 w16cex w16sdtdh w16sdtfl w16du">
   <w:docDefaults>
     <w:rPrDefault>
       <w:rPr>

</xml_diff>